<commit_message>
Project Final Report and Project Files Upload
</commit_message>
<xml_diff>
--- a/GymHub Final Project Report.docx
+++ b/GymHub Final Project Report.docx
@@ -88,6 +88,19 @@
         </w:rPr>
         <w:t>1. Abstract</w:t>
       </w:r>
+      <w:r>
+        <w:rPr>
+          <w:rFonts w:ascii="Times New Roman" w:eastAsia="Times New Roman" w:hAnsi="Times New Roman" w:cs="Times New Roman"/>
+          <w:b/>
+          <w:bCs/>
+          <w:kern w:val="0"/>
+          <w:sz w:val="40"/>
+          <w:szCs w:val="40"/>
+          <w:lang w:eastAsia="en-IN"/>
+          <w14:ligatures w14:val="none"/>
+        </w:rPr>
+        <w:t xml:space="preserve"> and Outcome</w:t>
+      </w:r>
     </w:p>
     <w:p>
       <w:pPr>
@@ -110,7 +123,31 @@
           <w:lang w:eastAsia="en-IN"/>
           <w14:ligatures w14:val="none"/>
         </w:rPr>
-        <w:t>Gym Hub is a full-stack web application developed to simplify gym management operations. The system enables administrators to manage members, trainers, membership plans, workout programs, and enrollments through a centralized dashboard. The application uses MongoDB as the database, Express.js and Node.js for backend API development, and HTML, CSS, and JavaScript for the frontend.</w:t>
+        <w:t xml:space="preserve">Gym Hub is a full-stack web application developed to simplify gym management operations. The system enables administrators to manage members, trainers, membership plans, workout programs, and </w:t>
+      </w:r>
+      <w:proofErr w:type="spellStart"/>
+      <w:r>
+        <w:rPr>
+          <w:rFonts w:ascii="Times New Roman" w:eastAsia="Times New Roman" w:hAnsi="Times New Roman" w:cs="Times New Roman"/>
+          <w:kern w:val="0"/>
+          <w:sz w:val="30"/>
+          <w:szCs w:val="30"/>
+          <w:lang w:eastAsia="en-IN"/>
+          <w14:ligatures w14:val="none"/>
+        </w:rPr>
+        <w:t>enrollments</w:t>
+      </w:r>
+      <w:proofErr w:type="spellEnd"/>
+      <w:r>
+        <w:rPr>
+          <w:rFonts w:ascii="Times New Roman" w:eastAsia="Times New Roman" w:hAnsi="Times New Roman" w:cs="Times New Roman"/>
+          <w:kern w:val="0"/>
+          <w:sz w:val="30"/>
+          <w:szCs w:val="30"/>
+          <w:lang w:eastAsia="en-IN"/>
+          <w14:ligatures w14:val="none"/>
+        </w:rPr>
+        <w:t xml:space="preserve"> through a centralized dashboard. The application uses MongoDB as the database, Express.js and Node.js for backend API development, and HTML, CSS, and JavaScript for the frontend.</w:t>
       </w:r>
     </w:p>
     <w:p>
@@ -134,7 +171,55 @@
           <w:lang w:eastAsia="en-IN"/>
           <w14:ligatures w14:val="none"/>
         </w:rPr>
-        <w:t>The project demonstrates CRUD operations, RESTful API development, MongoDB document modeling, relationship management using ObjectId references, and frontend-backend integration through Fetch API.</w:t>
+        <w:t xml:space="preserve">The project demonstrates CRUD operations, RESTful API development, MongoDB document </w:t>
+      </w:r>
+      <w:proofErr w:type="spellStart"/>
+      <w:r>
+        <w:rPr>
+          <w:rFonts w:ascii="Times New Roman" w:eastAsia="Times New Roman" w:hAnsi="Times New Roman" w:cs="Times New Roman"/>
+          <w:kern w:val="0"/>
+          <w:sz w:val="30"/>
+          <w:szCs w:val="30"/>
+          <w:lang w:eastAsia="en-IN"/>
+          <w14:ligatures w14:val="none"/>
+        </w:rPr>
+        <w:t>modeling</w:t>
+      </w:r>
+      <w:proofErr w:type="spellEnd"/>
+      <w:r>
+        <w:rPr>
+          <w:rFonts w:ascii="Times New Roman" w:eastAsia="Times New Roman" w:hAnsi="Times New Roman" w:cs="Times New Roman"/>
+          <w:kern w:val="0"/>
+          <w:sz w:val="30"/>
+          <w:szCs w:val="30"/>
+          <w:lang w:eastAsia="en-IN"/>
+          <w14:ligatures w14:val="none"/>
+        </w:rPr>
+        <w:t xml:space="preserve">, relationship management using </w:t>
+      </w:r>
+      <w:proofErr w:type="spellStart"/>
+      <w:r>
+        <w:rPr>
+          <w:rFonts w:ascii="Times New Roman" w:eastAsia="Times New Roman" w:hAnsi="Times New Roman" w:cs="Times New Roman"/>
+          <w:kern w:val="0"/>
+          <w:sz w:val="30"/>
+          <w:szCs w:val="30"/>
+          <w:lang w:eastAsia="en-IN"/>
+          <w14:ligatures w14:val="none"/>
+        </w:rPr>
+        <w:t>ObjectId</w:t>
+      </w:r>
+      <w:proofErr w:type="spellEnd"/>
+      <w:r>
+        <w:rPr>
+          <w:rFonts w:ascii="Times New Roman" w:eastAsia="Times New Roman" w:hAnsi="Times New Roman" w:cs="Times New Roman"/>
+          <w:kern w:val="0"/>
+          <w:sz w:val="30"/>
+          <w:szCs w:val="30"/>
+          <w:lang w:eastAsia="en-IN"/>
+          <w14:ligatures w14:val="none"/>
+        </w:rPr>
+        <w:t xml:space="preserve"> references, and frontend-backend integration through Fetch API.</w:t>
       </w:r>
     </w:p>
     <w:p>
@@ -307,16 +392,29 @@
           <w14:ligatures w14:val="none"/>
         </w:rPr>
       </w:pPr>
-      <w:r>
-        <w:rPr>
-          <w:rFonts w:ascii="Times New Roman" w:eastAsia="Times New Roman" w:hAnsi="Times New Roman" w:cs="Times New Roman"/>
-          <w:kern w:val="0"/>
-          <w:sz w:val="30"/>
-          <w:szCs w:val="30"/>
-          <w:lang w:eastAsia="en-IN"/>
-          <w14:ligatures w14:val="none"/>
-        </w:rPr>
-        <w:t>Enroll members into workout programs and plans.</w:t>
+      <w:proofErr w:type="spellStart"/>
+      <w:r>
+        <w:rPr>
+          <w:rFonts w:ascii="Times New Roman" w:eastAsia="Times New Roman" w:hAnsi="Times New Roman" w:cs="Times New Roman"/>
+          <w:kern w:val="0"/>
+          <w:sz w:val="30"/>
+          <w:szCs w:val="30"/>
+          <w:lang w:eastAsia="en-IN"/>
+          <w14:ligatures w14:val="none"/>
+        </w:rPr>
+        <w:t>Enroll</w:t>
+      </w:r>
+      <w:proofErr w:type="spellEnd"/>
+      <w:r>
+        <w:rPr>
+          <w:rFonts w:ascii="Times New Roman" w:eastAsia="Times New Roman" w:hAnsi="Times New Roman" w:cs="Times New Roman"/>
+          <w:kern w:val="0"/>
+          <w:sz w:val="30"/>
+          <w:szCs w:val="30"/>
+          <w:lang w:eastAsia="en-IN"/>
+          <w14:ligatures w14:val="none"/>
+        </w:rPr>
+        <w:t xml:space="preserve"> members into workout programs and plans.</w:t>
       </w:r>
     </w:p>
     <w:p>
@@ -344,7 +442,31 @@
           <w:lang w:eastAsia="en-IN"/>
           <w14:ligatures w14:val="none"/>
         </w:rPr>
-        <w:t>Demonstrate MongoDB relationships using references and populate().</w:t>
+        <w:t xml:space="preserve">Demonstrate MongoDB relationships using references and </w:t>
+      </w:r>
+      <w:proofErr w:type="gramStart"/>
+      <w:r>
+        <w:rPr>
+          <w:rFonts w:ascii="Times New Roman" w:eastAsia="Times New Roman" w:hAnsi="Times New Roman" w:cs="Times New Roman"/>
+          <w:kern w:val="0"/>
+          <w:sz w:val="30"/>
+          <w:szCs w:val="30"/>
+          <w:lang w:eastAsia="en-IN"/>
+          <w14:ligatures w14:val="none"/>
+        </w:rPr>
+        <w:t>populate(</w:t>
+      </w:r>
+      <w:proofErr w:type="gramEnd"/>
+      <w:r>
+        <w:rPr>
+          <w:rFonts w:ascii="Times New Roman" w:eastAsia="Times New Roman" w:hAnsi="Times New Roman" w:cs="Times New Roman"/>
+          <w:kern w:val="0"/>
+          <w:sz w:val="30"/>
+          <w:szCs w:val="30"/>
+          <w:lang w:eastAsia="en-IN"/>
+          <w14:ligatures w14:val="none"/>
+        </w:rPr>
+        <w:t>).</w:t>
       </w:r>
     </w:p>
     <w:p>
@@ -763,9 +885,958 @@
         <w:spacing w:after="0" w:line="240" w:lineRule="auto"/>
         <w:rPr>
           <w:rFonts w:ascii="Times New Roman" w:eastAsia="Times New Roman" w:hAnsi="Times New Roman" w:cs="Times New Roman"/>
-          <w:kern w:val="0"/>
-          <w:sz w:val="30"/>
-          <w:szCs w:val="30"/>
+          <w:b/>
+          <w:bCs/>
+          <w:kern w:val="0"/>
+          <w:sz w:val="40"/>
+          <w:szCs w:val="40"/>
+          <w:lang w:eastAsia="en-IN"/>
+          <w14:ligatures w14:val="none"/>
+        </w:rPr>
+      </w:pPr>
+      <w:proofErr w:type="gramStart"/>
+      <w:r>
+        <w:rPr>
+          <w:rFonts w:ascii="Times New Roman" w:eastAsia="Times New Roman" w:hAnsi="Times New Roman" w:cs="Times New Roman"/>
+          <w:b/>
+          <w:bCs/>
+          <w:kern w:val="0"/>
+          <w:sz w:val="40"/>
+          <w:szCs w:val="40"/>
+          <w:lang w:eastAsia="en-IN"/>
+          <w14:ligatures w14:val="none"/>
+        </w:rPr>
+        <w:t>Versions :</w:t>
+      </w:r>
+      <w:proofErr w:type="gramEnd"/>
+    </w:p>
+    <w:tbl>
+      <w:tblPr>
+        <w:tblW w:w="0" w:type="auto"/>
+        <w:tblCellSpacing w:w="15" w:type="dxa"/>
+        <w:tblCellMar>
+          <w:top w:w="15" w:type="dxa"/>
+          <w:left w:w="15" w:type="dxa"/>
+          <w:bottom w:w="15" w:type="dxa"/>
+          <w:right w:w="15" w:type="dxa"/>
+        </w:tblCellMar>
+        <w:tblLook w:val="04A0" w:firstRow="1" w:lastRow="0" w:firstColumn="1" w:lastColumn="0" w:noHBand="0" w:noVBand="1"/>
+      </w:tblPr>
+      <w:tblGrid>
+        <w:gridCol w:w="3969"/>
+        <w:gridCol w:w="1195"/>
+      </w:tblGrid>
+      <w:tr>
+        <w:trPr>
+          <w:tblHeader/>
+          <w:tblCellSpacing w:w="15" w:type="dxa"/>
+        </w:trPr>
+        <w:tc>
+          <w:tcPr>
+            <w:tcW w:w="0" w:type="auto"/>
+            <w:vAlign w:val="center"/>
+            <w:hideMark/>
+          </w:tcPr>
+          <w:p>
+            <w:pPr>
+              <w:spacing w:after="0" w:line="240" w:lineRule="auto"/>
+              <w:rPr>
+                <w:rFonts w:ascii="Times New Roman" w:eastAsia="Times New Roman" w:hAnsi="Times New Roman" w:cs="Times New Roman"/>
+                <w:kern w:val="0"/>
+                <w:sz w:val="32"/>
+                <w:szCs w:val="32"/>
+                <w:lang w:eastAsia="en-IN"/>
+                <w14:ligatures w14:val="none"/>
+              </w:rPr>
+            </w:pPr>
+            <w:r>
+              <w:rPr>
+                <w:rFonts w:ascii="Times New Roman" w:eastAsia="Times New Roman" w:hAnsi="Times New Roman" w:cs="Times New Roman"/>
+                <w:kern w:val="0"/>
+                <w:sz w:val="32"/>
+                <w:szCs w:val="32"/>
+                <w:lang w:eastAsia="en-IN"/>
+                <w14:ligatures w14:val="none"/>
+              </w:rPr>
+              <w:t>Tool</w:t>
+            </w:r>
+          </w:p>
+          <w:p>
+            <w:pPr>
+              <w:spacing w:after="0" w:line="240" w:lineRule="auto"/>
+              <w:rPr>
+                <w:rFonts w:ascii="Times New Roman" w:eastAsia="Times New Roman" w:hAnsi="Times New Roman" w:cs="Times New Roman"/>
+                <w:kern w:val="0"/>
+                <w:sz w:val="32"/>
+                <w:szCs w:val="32"/>
+                <w:lang w:eastAsia="en-IN"/>
+                <w14:ligatures w14:val="none"/>
+              </w:rPr>
+            </w:pPr>
+          </w:p>
+        </w:tc>
+        <w:tc>
+          <w:tcPr>
+            <w:tcW w:w="0" w:type="auto"/>
+            <w:vAlign w:val="center"/>
+            <w:hideMark/>
+          </w:tcPr>
+          <w:p>
+            <w:pPr>
+              <w:spacing w:after="0" w:line="240" w:lineRule="auto"/>
+              <w:rPr>
+                <w:rFonts w:ascii="Times New Roman" w:eastAsia="Times New Roman" w:hAnsi="Times New Roman" w:cs="Times New Roman"/>
+                <w:kern w:val="0"/>
+                <w:sz w:val="32"/>
+                <w:szCs w:val="32"/>
+                <w:lang w:eastAsia="en-IN"/>
+                <w14:ligatures w14:val="none"/>
+              </w:rPr>
+            </w:pPr>
+            <w:r>
+              <w:rPr>
+                <w:rFonts w:ascii="Times New Roman" w:eastAsia="Times New Roman" w:hAnsi="Times New Roman" w:cs="Times New Roman"/>
+                <w:kern w:val="0"/>
+                <w:sz w:val="32"/>
+                <w:szCs w:val="32"/>
+                <w:lang w:eastAsia="en-IN"/>
+                <w14:ligatures w14:val="none"/>
+              </w:rPr>
+              <w:t>Version</w:t>
+            </w:r>
+          </w:p>
+        </w:tc>
+      </w:tr>
+      <w:tr>
+        <w:trPr>
+          <w:tblCellSpacing w:w="15" w:type="dxa"/>
+        </w:trPr>
+        <w:tc>
+          <w:tcPr>
+            <w:tcW w:w="0" w:type="auto"/>
+            <w:vAlign w:val="center"/>
+            <w:hideMark/>
+          </w:tcPr>
+          <w:p>
+            <w:pPr>
+              <w:spacing w:after="0" w:line="240" w:lineRule="auto"/>
+              <w:rPr>
+                <w:rFonts w:ascii="Times New Roman" w:eastAsia="Times New Roman" w:hAnsi="Times New Roman" w:cs="Times New Roman"/>
+                <w:kern w:val="0"/>
+                <w:sz w:val="32"/>
+                <w:szCs w:val="32"/>
+                <w:lang w:eastAsia="en-IN"/>
+                <w14:ligatures w14:val="none"/>
+              </w:rPr>
+            </w:pPr>
+            <w:r>
+              <w:rPr>
+                <w:rFonts w:ascii="Times New Roman" w:eastAsia="Times New Roman" w:hAnsi="Times New Roman" w:cs="Times New Roman"/>
+                <w:kern w:val="0"/>
+                <w:sz w:val="32"/>
+                <w:szCs w:val="32"/>
+                <w:lang w:eastAsia="en-IN"/>
+                <w14:ligatures w14:val="none"/>
+              </w:rPr>
+              <w:t>Node.js</w:t>
+            </w:r>
+          </w:p>
+          <w:p>
+            <w:pPr>
+              <w:spacing w:after="0" w:line="240" w:lineRule="auto"/>
+              <w:rPr>
+                <w:rFonts w:ascii="Times New Roman" w:eastAsia="Times New Roman" w:hAnsi="Times New Roman" w:cs="Times New Roman"/>
+                <w:kern w:val="0"/>
+                <w:sz w:val="32"/>
+                <w:szCs w:val="32"/>
+                <w:lang w:eastAsia="en-IN"/>
+                <w14:ligatures w14:val="none"/>
+              </w:rPr>
+            </w:pPr>
+          </w:p>
+        </w:tc>
+        <w:tc>
+          <w:tcPr>
+            <w:tcW w:w="0" w:type="auto"/>
+            <w:vAlign w:val="center"/>
+            <w:hideMark/>
+          </w:tcPr>
+          <w:p>
+            <w:pPr>
+              <w:spacing w:after="0" w:line="240" w:lineRule="auto"/>
+              <w:rPr>
+                <w:rFonts w:ascii="Times New Roman" w:eastAsia="Times New Roman" w:hAnsi="Times New Roman" w:cs="Times New Roman"/>
+                <w:kern w:val="0"/>
+                <w:sz w:val="32"/>
+                <w:szCs w:val="32"/>
+                <w:lang w:eastAsia="en-IN"/>
+                <w14:ligatures w14:val="none"/>
+              </w:rPr>
+            </w:pPr>
+            <w:r>
+              <w:rPr>
+                <w:rFonts w:ascii="Times New Roman" w:eastAsia="Times New Roman" w:hAnsi="Times New Roman" w:cs="Times New Roman"/>
+                <w:kern w:val="0"/>
+                <w:sz w:val="32"/>
+                <w:szCs w:val="32"/>
+                <w:lang w:eastAsia="en-IN"/>
+                <w14:ligatures w14:val="none"/>
+              </w:rPr>
+              <w:t>v24.16.0</w:t>
+            </w:r>
+          </w:p>
+        </w:tc>
+      </w:tr>
+      <w:tr>
+        <w:trPr>
+          <w:tblCellSpacing w:w="15" w:type="dxa"/>
+        </w:trPr>
+        <w:tc>
+          <w:tcPr>
+            <w:tcW w:w="0" w:type="auto"/>
+            <w:vAlign w:val="center"/>
+            <w:hideMark/>
+          </w:tcPr>
+          <w:p>
+            <w:pPr>
+              <w:spacing w:after="0" w:line="240" w:lineRule="auto"/>
+              <w:rPr>
+                <w:rFonts w:ascii="Times New Roman" w:eastAsia="Times New Roman" w:hAnsi="Times New Roman" w:cs="Times New Roman"/>
+                <w:kern w:val="0"/>
+                <w:sz w:val="32"/>
+                <w:szCs w:val="32"/>
+                <w:lang w:eastAsia="en-IN"/>
+                <w14:ligatures w14:val="none"/>
+              </w:rPr>
+            </w:pPr>
+            <w:proofErr w:type="spellStart"/>
+            <w:r>
+              <w:rPr>
+                <w:rFonts w:ascii="Times New Roman" w:eastAsia="Times New Roman" w:hAnsi="Times New Roman" w:cs="Times New Roman"/>
+                <w:kern w:val="0"/>
+                <w:sz w:val="32"/>
+                <w:szCs w:val="32"/>
+                <w:lang w:eastAsia="en-IN"/>
+                <w14:ligatures w14:val="none"/>
+              </w:rPr>
+              <w:t>N</w:t>
+            </w:r>
+            <w:r>
+              <w:rPr>
+                <w:rFonts w:ascii="Times New Roman" w:eastAsia="Times New Roman" w:hAnsi="Times New Roman" w:cs="Times New Roman"/>
+                <w:kern w:val="0"/>
+                <w:sz w:val="32"/>
+                <w:szCs w:val="32"/>
+                <w:lang w:eastAsia="en-IN"/>
+                <w14:ligatures w14:val="none"/>
+              </w:rPr>
+              <w:t>pm</w:t>
+            </w:r>
+            <w:proofErr w:type="spellEnd"/>
+          </w:p>
+          <w:p>
+            <w:pPr>
+              <w:spacing w:after="0" w:line="240" w:lineRule="auto"/>
+              <w:rPr>
+                <w:rFonts w:ascii="Times New Roman" w:eastAsia="Times New Roman" w:hAnsi="Times New Roman" w:cs="Times New Roman"/>
+                <w:kern w:val="0"/>
+                <w:sz w:val="32"/>
+                <w:szCs w:val="32"/>
+                <w:lang w:eastAsia="en-IN"/>
+                <w14:ligatures w14:val="none"/>
+              </w:rPr>
+            </w:pPr>
+          </w:p>
+        </w:tc>
+        <w:tc>
+          <w:tcPr>
+            <w:tcW w:w="0" w:type="auto"/>
+            <w:vAlign w:val="center"/>
+            <w:hideMark/>
+          </w:tcPr>
+          <w:p>
+            <w:pPr>
+              <w:spacing w:after="0" w:line="240" w:lineRule="auto"/>
+              <w:rPr>
+                <w:rFonts w:ascii="Times New Roman" w:eastAsia="Times New Roman" w:hAnsi="Times New Roman" w:cs="Times New Roman"/>
+                <w:kern w:val="0"/>
+                <w:sz w:val="32"/>
+                <w:szCs w:val="32"/>
+                <w:lang w:eastAsia="en-IN"/>
+                <w14:ligatures w14:val="none"/>
+              </w:rPr>
+            </w:pPr>
+            <w:r>
+              <w:rPr>
+                <w:rFonts w:ascii="Times New Roman" w:eastAsia="Times New Roman" w:hAnsi="Times New Roman" w:cs="Times New Roman"/>
+                <w:kern w:val="0"/>
+                <w:sz w:val="32"/>
+                <w:szCs w:val="32"/>
+                <w:lang w:eastAsia="en-IN"/>
+                <w14:ligatures w14:val="none"/>
+              </w:rPr>
+              <w:t>v11.13.0</w:t>
+            </w:r>
+          </w:p>
+        </w:tc>
+      </w:tr>
+      <w:tr>
+        <w:trPr>
+          <w:tblCellSpacing w:w="15" w:type="dxa"/>
+        </w:trPr>
+        <w:tc>
+          <w:tcPr>
+            <w:tcW w:w="0" w:type="auto"/>
+            <w:vAlign w:val="center"/>
+            <w:hideMark/>
+          </w:tcPr>
+          <w:p>
+            <w:pPr>
+              <w:spacing w:after="0" w:line="240" w:lineRule="auto"/>
+              <w:rPr>
+                <w:rFonts w:ascii="Times New Roman" w:eastAsia="Times New Roman" w:hAnsi="Times New Roman" w:cs="Times New Roman"/>
+                <w:kern w:val="0"/>
+                <w:sz w:val="32"/>
+                <w:szCs w:val="32"/>
+                <w:lang w:eastAsia="en-IN"/>
+                <w14:ligatures w14:val="none"/>
+              </w:rPr>
+            </w:pPr>
+            <w:r>
+              <w:rPr>
+                <w:rFonts w:ascii="Times New Roman" w:eastAsia="Times New Roman" w:hAnsi="Times New Roman" w:cs="Times New Roman"/>
+                <w:kern w:val="0"/>
+                <w:sz w:val="32"/>
+                <w:szCs w:val="32"/>
+                <w:lang w:eastAsia="en-IN"/>
+                <w14:ligatures w14:val="none"/>
+              </w:rPr>
+              <w:t>MongoDB Community Server</w:t>
+            </w:r>
+          </w:p>
+          <w:p>
+            <w:pPr>
+              <w:spacing w:after="0" w:line="240" w:lineRule="auto"/>
+              <w:rPr>
+                <w:rFonts w:ascii="Times New Roman" w:eastAsia="Times New Roman" w:hAnsi="Times New Roman" w:cs="Times New Roman"/>
+                <w:kern w:val="0"/>
+                <w:sz w:val="32"/>
+                <w:szCs w:val="32"/>
+                <w:lang w:eastAsia="en-IN"/>
+                <w14:ligatures w14:val="none"/>
+              </w:rPr>
+            </w:pPr>
+          </w:p>
+        </w:tc>
+        <w:tc>
+          <w:tcPr>
+            <w:tcW w:w="0" w:type="auto"/>
+            <w:vAlign w:val="center"/>
+            <w:hideMark/>
+          </w:tcPr>
+          <w:p>
+            <w:pPr>
+              <w:spacing w:after="0" w:line="240" w:lineRule="auto"/>
+              <w:rPr>
+                <w:rFonts w:ascii="Times New Roman" w:eastAsia="Times New Roman" w:hAnsi="Times New Roman" w:cs="Times New Roman"/>
+                <w:kern w:val="0"/>
+                <w:sz w:val="32"/>
+                <w:szCs w:val="32"/>
+                <w:lang w:eastAsia="en-IN"/>
+                <w14:ligatures w14:val="none"/>
+              </w:rPr>
+            </w:pPr>
+            <w:r>
+              <w:rPr>
+                <w:rFonts w:ascii="Times New Roman" w:eastAsia="Times New Roman" w:hAnsi="Times New Roman" w:cs="Times New Roman"/>
+                <w:kern w:val="0"/>
+                <w:sz w:val="32"/>
+                <w:szCs w:val="32"/>
+                <w:lang w:eastAsia="en-IN"/>
+                <w14:ligatures w14:val="none"/>
+              </w:rPr>
+              <w:t>v8.3.2</w:t>
+            </w:r>
+          </w:p>
+        </w:tc>
+      </w:tr>
+      <w:tr>
+        <w:trPr>
+          <w:tblCellSpacing w:w="15" w:type="dxa"/>
+        </w:trPr>
+        <w:tc>
+          <w:tcPr>
+            <w:tcW w:w="0" w:type="auto"/>
+            <w:vAlign w:val="center"/>
+            <w:hideMark/>
+          </w:tcPr>
+          <w:p>
+            <w:pPr>
+              <w:spacing w:after="0" w:line="240" w:lineRule="auto"/>
+              <w:rPr>
+                <w:rFonts w:ascii="Times New Roman" w:eastAsia="Times New Roman" w:hAnsi="Times New Roman" w:cs="Times New Roman"/>
+                <w:kern w:val="0"/>
+                <w:sz w:val="32"/>
+                <w:szCs w:val="32"/>
+                <w:lang w:eastAsia="en-IN"/>
+                <w14:ligatures w14:val="none"/>
+              </w:rPr>
+            </w:pPr>
+            <w:r>
+              <w:rPr>
+                <w:rFonts w:ascii="Times New Roman" w:eastAsia="Times New Roman" w:hAnsi="Times New Roman" w:cs="Times New Roman"/>
+                <w:kern w:val="0"/>
+                <w:sz w:val="32"/>
+                <w:szCs w:val="32"/>
+                <w:lang w:eastAsia="en-IN"/>
+                <w14:ligatures w14:val="none"/>
+              </w:rPr>
+              <w:t>MongoDB Compass</w:t>
+            </w:r>
+          </w:p>
+          <w:p>
+            <w:pPr>
+              <w:spacing w:after="0" w:line="240" w:lineRule="auto"/>
+              <w:rPr>
+                <w:rFonts w:ascii="Times New Roman" w:eastAsia="Times New Roman" w:hAnsi="Times New Roman" w:cs="Times New Roman"/>
+                <w:kern w:val="0"/>
+                <w:sz w:val="32"/>
+                <w:szCs w:val="32"/>
+                <w:lang w:eastAsia="en-IN"/>
+                <w14:ligatures w14:val="none"/>
+              </w:rPr>
+            </w:pPr>
+          </w:p>
+        </w:tc>
+        <w:tc>
+          <w:tcPr>
+            <w:tcW w:w="0" w:type="auto"/>
+            <w:vAlign w:val="center"/>
+            <w:hideMark/>
+          </w:tcPr>
+          <w:p>
+            <w:pPr>
+              <w:spacing w:after="0" w:line="240" w:lineRule="auto"/>
+              <w:rPr>
+                <w:rFonts w:ascii="Times New Roman" w:eastAsia="Times New Roman" w:hAnsi="Times New Roman" w:cs="Times New Roman"/>
+                <w:kern w:val="0"/>
+                <w:sz w:val="32"/>
+                <w:szCs w:val="32"/>
+                <w:lang w:eastAsia="en-IN"/>
+                <w14:ligatures w14:val="none"/>
+              </w:rPr>
+            </w:pPr>
+            <w:r>
+              <w:rPr>
+                <w:rFonts w:ascii="Times New Roman" w:eastAsia="Times New Roman" w:hAnsi="Times New Roman" w:cs="Times New Roman"/>
+                <w:kern w:val="0"/>
+                <w:sz w:val="32"/>
+                <w:szCs w:val="32"/>
+                <w:lang w:eastAsia="en-IN"/>
+                <w14:ligatures w14:val="none"/>
+              </w:rPr>
+              <w:t>v1.4</w:t>
+            </w:r>
+            <w:r>
+              <w:rPr>
+                <w:rFonts w:ascii="Times New Roman" w:eastAsia="Times New Roman" w:hAnsi="Times New Roman" w:cs="Times New Roman"/>
+                <w:kern w:val="0"/>
+                <w:sz w:val="32"/>
+                <w:szCs w:val="32"/>
+                <w:lang w:eastAsia="en-IN"/>
+                <w14:ligatures w14:val="none"/>
+              </w:rPr>
+              <w:t>9</w:t>
+            </w:r>
+            <w:r>
+              <w:rPr>
+                <w:rFonts w:ascii="Times New Roman" w:eastAsia="Times New Roman" w:hAnsi="Times New Roman" w:cs="Times New Roman"/>
+                <w:kern w:val="0"/>
+                <w:sz w:val="32"/>
+                <w:szCs w:val="32"/>
+                <w:lang w:eastAsia="en-IN"/>
+                <w14:ligatures w14:val="none"/>
+              </w:rPr>
+              <w:t>.</w:t>
+            </w:r>
+            <w:r>
+              <w:rPr>
+                <w:rFonts w:ascii="Times New Roman" w:eastAsia="Times New Roman" w:hAnsi="Times New Roman" w:cs="Times New Roman"/>
+                <w:kern w:val="0"/>
+                <w:sz w:val="32"/>
+                <w:szCs w:val="32"/>
+                <w:lang w:eastAsia="en-IN"/>
+                <w14:ligatures w14:val="none"/>
+              </w:rPr>
+              <w:t>8</w:t>
+            </w:r>
+          </w:p>
+        </w:tc>
+      </w:tr>
+      <w:tr>
+        <w:trPr>
+          <w:tblCellSpacing w:w="15" w:type="dxa"/>
+        </w:trPr>
+        <w:tc>
+          <w:tcPr>
+            <w:tcW w:w="0" w:type="auto"/>
+            <w:vAlign w:val="center"/>
+            <w:hideMark/>
+          </w:tcPr>
+          <w:p>
+            <w:pPr>
+              <w:spacing w:after="0" w:line="240" w:lineRule="auto"/>
+              <w:rPr>
+                <w:rFonts w:ascii="Times New Roman" w:eastAsia="Times New Roman" w:hAnsi="Times New Roman" w:cs="Times New Roman"/>
+                <w:kern w:val="0"/>
+                <w:sz w:val="32"/>
+                <w:szCs w:val="32"/>
+                <w:lang w:eastAsia="en-IN"/>
+                <w14:ligatures w14:val="none"/>
+              </w:rPr>
+            </w:pPr>
+            <w:r>
+              <w:rPr>
+                <w:rFonts w:ascii="Times New Roman" w:eastAsia="Times New Roman" w:hAnsi="Times New Roman" w:cs="Times New Roman"/>
+                <w:kern w:val="0"/>
+                <w:sz w:val="32"/>
+                <w:szCs w:val="32"/>
+                <w:lang w:eastAsia="en-IN"/>
+                <w14:ligatures w14:val="none"/>
+              </w:rPr>
+              <w:t>MongoDB Shell</w:t>
+            </w:r>
+          </w:p>
+          <w:p>
+            <w:pPr>
+              <w:spacing w:after="0" w:line="240" w:lineRule="auto"/>
+              <w:rPr>
+                <w:rFonts w:ascii="Times New Roman" w:eastAsia="Times New Roman" w:hAnsi="Times New Roman" w:cs="Times New Roman"/>
+                <w:kern w:val="0"/>
+                <w:sz w:val="32"/>
+                <w:szCs w:val="32"/>
+                <w:lang w:eastAsia="en-IN"/>
+                <w14:ligatures w14:val="none"/>
+              </w:rPr>
+            </w:pPr>
+          </w:p>
+        </w:tc>
+        <w:tc>
+          <w:tcPr>
+            <w:tcW w:w="0" w:type="auto"/>
+            <w:vAlign w:val="center"/>
+            <w:hideMark/>
+          </w:tcPr>
+          <w:p>
+            <w:pPr>
+              <w:spacing w:after="0" w:line="240" w:lineRule="auto"/>
+              <w:rPr>
+                <w:rFonts w:ascii="Times New Roman" w:eastAsia="Times New Roman" w:hAnsi="Times New Roman" w:cs="Times New Roman"/>
+                <w:kern w:val="0"/>
+                <w:sz w:val="32"/>
+                <w:szCs w:val="32"/>
+                <w:lang w:eastAsia="en-IN"/>
+                <w14:ligatures w14:val="none"/>
+              </w:rPr>
+            </w:pPr>
+            <w:r>
+              <w:rPr>
+                <w:rFonts w:ascii="Times New Roman" w:eastAsia="Times New Roman" w:hAnsi="Times New Roman" w:cs="Times New Roman"/>
+                <w:kern w:val="0"/>
+                <w:sz w:val="32"/>
+                <w:szCs w:val="32"/>
+                <w:lang w:eastAsia="en-IN"/>
+                <w14:ligatures w14:val="none"/>
+              </w:rPr>
+              <w:t>v2.8.3</w:t>
+            </w:r>
+          </w:p>
+        </w:tc>
+      </w:tr>
+      <w:tr>
+        <w:trPr>
+          <w:tblCellSpacing w:w="15" w:type="dxa"/>
+        </w:trPr>
+        <w:tc>
+          <w:tcPr>
+            <w:tcW w:w="0" w:type="auto"/>
+            <w:vAlign w:val="center"/>
+            <w:hideMark/>
+          </w:tcPr>
+          <w:p>
+            <w:pPr>
+              <w:spacing w:after="0" w:line="240" w:lineRule="auto"/>
+              <w:rPr>
+                <w:rFonts w:ascii="Times New Roman" w:eastAsia="Times New Roman" w:hAnsi="Times New Roman" w:cs="Times New Roman"/>
+                <w:kern w:val="0"/>
+                <w:sz w:val="32"/>
+                <w:szCs w:val="32"/>
+                <w:lang w:eastAsia="en-IN"/>
+                <w14:ligatures w14:val="none"/>
+              </w:rPr>
+            </w:pPr>
+            <w:r>
+              <w:rPr>
+                <w:rFonts w:ascii="Times New Roman" w:eastAsia="Times New Roman" w:hAnsi="Times New Roman" w:cs="Times New Roman"/>
+                <w:kern w:val="0"/>
+                <w:sz w:val="32"/>
+                <w:szCs w:val="32"/>
+                <w:lang w:eastAsia="en-IN"/>
+                <w14:ligatures w14:val="none"/>
+              </w:rPr>
+              <w:t>Express.js</w:t>
+            </w:r>
+          </w:p>
+          <w:p>
+            <w:pPr>
+              <w:spacing w:after="0" w:line="240" w:lineRule="auto"/>
+              <w:rPr>
+                <w:rFonts w:ascii="Times New Roman" w:eastAsia="Times New Roman" w:hAnsi="Times New Roman" w:cs="Times New Roman"/>
+                <w:kern w:val="0"/>
+                <w:sz w:val="32"/>
+                <w:szCs w:val="32"/>
+                <w:lang w:eastAsia="en-IN"/>
+                <w14:ligatures w14:val="none"/>
+              </w:rPr>
+            </w:pPr>
+          </w:p>
+        </w:tc>
+        <w:tc>
+          <w:tcPr>
+            <w:tcW w:w="0" w:type="auto"/>
+            <w:vAlign w:val="center"/>
+            <w:hideMark/>
+          </w:tcPr>
+          <w:p>
+            <w:pPr>
+              <w:spacing w:after="0" w:line="240" w:lineRule="auto"/>
+              <w:rPr>
+                <w:rFonts w:ascii="Times New Roman" w:eastAsia="Times New Roman" w:hAnsi="Times New Roman" w:cs="Times New Roman"/>
+                <w:kern w:val="0"/>
+                <w:sz w:val="32"/>
+                <w:szCs w:val="32"/>
+                <w:lang w:eastAsia="en-IN"/>
+                <w14:ligatures w14:val="none"/>
+              </w:rPr>
+            </w:pPr>
+            <w:r>
+              <w:rPr>
+                <w:rFonts w:ascii="Times New Roman" w:eastAsia="Times New Roman" w:hAnsi="Times New Roman" w:cs="Times New Roman"/>
+                <w:kern w:val="0"/>
+                <w:sz w:val="32"/>
+                <w:szCs w:val="32"/>
+                <w:lang w:eastAsia="en-IN"/>
+                <w14:ligatures w14:val="none"/>
+              </w:rPr>
+              <w:t>v5.</w:t>
+            </w:r>
+            <w:r>
+              <w:rPr>
+                <w:rFonts w:ascii="Times New Roman" w:eastAsia="Times New Roman" w:hAnsi="Times New Roman" w:cs="Times New Roman"/>
+                <w:kern w:val="0"/>
+                <w:sz w:val="32"/>
+                <w:szCs w:val="32"/>
+                <w:lang w:eastAsia="en-IN"/>
+                <w14:ligatures w14:val="none"/>
+              </w:rPr>
+              <w:t>2.1</w:t>
+            </w:r>
+          </w:p>
+        </w:tc>
+      </w:tr>
+      <w:tr>
+        <w:trPr>
+          <w:tblCellSpacing w:w="15" w:type="dxa"/>
+        </w:trPr>
+        <w:tc>
+          <w:tcPr>
+            <w:tcW w:w="0" w:type="auto"/>
+            <w:vAlign w:val="center"/>
+            <w:hideMark/>
+          </w:tcPr>
+          <w:p>
+            <w:pPr>
+              <w:spacing w:after="0" w:line="240" w:lineRule="auto"/>
+              <w:rPr>
+                <w:rFonts w:ascii="Times New Roman" w:eastAsia="Times New Roman" w:hAnsi="Times New Roman" w:cs="Times New Roman"/>
+                <w:kern w:val="0"/>
+                <w:sz w:val="32"/>
+                <w:szCs w:val="32"/>
+                <w:lang w:eastAsia="en-IN"/>
+                <w14:ligatures w14:val="none"/>
+              </w:rPr>
+            </w:pPr>
+            <w:r>
+              <w:rPr>
+                <w:rFonts w:ascii="Times New Roman" w:eastAsia="Times New Roman" w:hAnsi="Times New Roman" w:cs="Times New Roman"/>
+                <w:kern w:val="0"/>
+                <w:sz w:val="32"/>
+                <w:szCs w:val="32"/>
+                <w:lang w:eastAsia="en-IN"/>
+                <w14:ligatures w14:val="none"/>
+              </w:rPr>
+              <w:t>Mongoose</w:t>
+            </w:r>
+          </w:p>
+          <w:p>
+            <w:pPr>
+              <w:spacing w:after="0" w:line="240" w:lineRule="auto"/>
+              <w:rPr>
+                <w:rFonts w:ascii="Times New Roman" w:eastAsia="Times New Roman" w:hAnsi="Times New Roman" w:cs="Times New Roman"/>
+                <w:kern w:val="0"/>
+                <w:sz w:val="32"/>
+                <w:szCs w:val="32"/>
+                <w:lang w:eastAsia="en-IN"/>
+                <w14:ligatures w14:val="none"/>
+              </w:rPr>
+            </w:pPr>
+          </w:p>
+        </w:tc>
+        <w:tc>
+          <w:tcPr>
+            <w:tcW w:w="0" w:type="auto"/>
+            <w:vAlign w:val="center"/>
+            <w:hideMark/>
+          </w:tcPr>
+          <w:p>
+            <w:pPr>
+              <w:spacing w:after="0" w:line="240" w:lineRule="auto"/>
+              <w:rPr>
+                <w:rFonts w:ascii="Times New Roman" w:eastAsia="Times New Roman" w:hAnsi="Times New Roman" w:cs="Times New Roman"/>
+                <w:kern w:val="0"/>
+                <w:sz w:val="32"/>
+                <w:szCs w:val="32"/>
+                <w:lang w:eastAsia="en-IN"/>
+                <w14:ligatures w14:val="none"/>
+              </w:rPr>
+            </w:pPr>
+            <w:r>
+              <w:rPr>
+                <w:rFonts w:ascii="Times New Roman" w:eastAsia="Times New Roman" w:hAnsi="Times New Roman" w:cs="Times New Roman"/>
+                <w:kern w:val="0"/>
+                <w:sz w:val="32"/>
+                <w:szCs w:val="32"/>
+                <w:lang w:eastAsia="en-IN"/>
+                <w14:ligatures w14:val="none"/>
+              </w:rPr>
+              <w:t>V</w:t>
+            </w:r>
+            <w:r>
+              <w:rPr>
+                <w:rFonts w:ascii="Times New Roman" w:eastAsia="Times New Roman" w:hAnsi="Times New Roman" w:cs="Times New Roman"/>
+                <w:kern w:val="0"/>
+                <w:sz w:val="32"/>
+                <w:szCs w:val="32"/>
+                <w:lang w:eastAsia="en-IN"/>
+                <w14:ligatures w14:val="none"/>
+              </w:rPr>
+              <w:t>9.7.0</w:t>
+            </w:r>
+          </w:p>
+        </w:tc>
+      </w:tr>
+      <w:tr>
+        <w:trPr>
+          <w:tblCellSpacing w:w="15" w:type="dxa"/>
+        </w:trPr>
+        <w:tc>
+          <w:tcPr>
+            <w:tcW w:w="0" w:type="auto"/>
+            <w:vAlign w:val="center"/>
+            <w:hideMark/>
+          </w:tcPr>
+          <w:p>
+            <w:pPr>
+              <w:spacing w:after="0" w:line="240" w:lineRule="auto"/>
+              <w:rPr>
+                <w:rFonts w:ascii="Times New Roman" w:eastAsia="Times New Roman" w:hAnsi="Times New Roman" w:cs="Times New Roman"/>
+                <w:kern w:val="0"/>
+                <w:sz w:val="32"/>
+                <w:szCs w:val="32"/>
+                <w:lang w:eastAsia="en-IN"/>
+                <w14:ligatures w14:val="none"/>
+              </w:rPr>
+            </w:pPr>
+            <w:r>
+              <w:rPr>
+                <w:rFonts w:ascii="Times New Roman" w:eastAsia="Times New Roman" w:hAnsi="Times New Roman" w:cs="Times New Roman"/>
+                <w:kern w:val="0"/>
+                <w:sz w:val="32"/>
+                <w:szCs w:val="32"/>
+                <w:lang w:eastAsia="en-IN"/>
+                <w14:ligatures w14:val="none"/>
+              </w:rPr>
+              <w:t>Visual Studio Code</w:t>
+            </w:r>
+          </w:p>
+        </w:tc>
+        <w:tc>
+          <w:tcPr>
+            <w:tcW w:w="0" w:type="auto"/>
+            <w:vAlign w:val="center"/>
+            <w:hideMark/>
+          </w:tcPr>
+          <w:p>
+            <w:pPr>
+              <w:spacing w:after="0" w:line="240" w:lineRule="auto"/>
+              <w:rPr>
+                <w:rFonts w:ascii="Times New Roman" w:eastAsia="Times New Roman" w:hAnsi="Times New Roman" w:cs="Times New Roman"/>
+                <w:kern w:val="0"/>
+                <w:sz w:val="32"/>
+                <w:szCs w:val="32"/>
+                <w:lang w:eastAsia="en-IN"/>
+                <w14:ligatures w14:val="none"/>
+              </w:rPr>
+            </w:pPr>
+            <w:r>
+              <w:rPr>
+                <w:rFonts w:ascii="Times New Roman" w:eastAsia="Times New Roman" w:hAnsi="Times New Roman" w:cs="Times New Roman"/>
+                <w:kern w:val="0"/>
+                <w:sz w:val="32"/>
+                <w:szCs w:val="32"/>
+                <w:lang w:eastAsia="en-IN"/>
+                <w14:ligatures w14:val="none"/>
+              </w:rPr>
+              <w:t>v1.1</w:t>
+            </w:r>
+            <w:r>
+              <w:rPr>
+                <w:rFonts w:ascii="Times New Roman" w:eastAsia="Times New Roman" w:hAnsi="Times New Roman" w:cs="Times New Roman"/>
+                <w:kern w:val="0"/>
+                <w:sz w:val="32"/>
+                <w:szCs w:val="32"/>
+                <w:lang w:eastAsia="en-IN"/>
+                <w14:ligatures w14:val="none"/>
+              </w:rPr>
+              <w:t>24</w:t>
+            </w:r>
+            <w:r>
+              <w:rPr>
+                <w:rFonts w:ascii="Times New Roman" w:eastAsia="Times New Roman" w:hAnsi="Times New Roman" w:cs="Times New Roman"/>
+                <w:kern w:val="0"/>
+                <w:sz w:val="32"/>
+                <w:szCs w:val="32"/>
+                <w:lang w:eastAsia="en-IN"/>
+                <w14:ligatures w14:val="none"/>
+              </w:rPr>
+              <w:t>.</w:t>
+            </w:r>
+            <w:r>
+              <w:rPr>
+                <w:rFonts w:ascii="Times New Roman" w:eastAsia="Times New Roman" w:hAnsi="Times New Roman" w:cs="Times New Roman"/>
+                <w:kern w:val="0"/>
+                <w:sz w:val="32"/>
+                <w:szCs w:val="32"/>
+                <w:lang w:eastAsia="en-IN"/>
+                <w14:ligatures w14:val="none"/>
+              </w:rPr>
+              <w:t>2</w:t>
+            </w:r>
+          </w:p>
+        </w:tc>
+      </w:tr>
+      <w:tr>
+        <w:trPr>
+          <w:tblCellSpacing w:w="15" w:type="dxa"/>
+        </w:trPr>
+        <w:tc>
+          <w:tcPr>
+            <w:tcW w:w="0" w:type="auto"/>
+            <w:vAlign w:val="center"/>
+            <w:hideMark/>
+          </w:tcPr>
+          <w:p>
+            <w:pPr>
+              <w:spacing w:after="0" w:line="240" w:lineRule="auto"/>
+              <w:rPr>
+                <w:rFonts w:ascii="Times New Roman" w:eastAsia="Times New Roman" w:hAnsi="Times New Roman" w:cs="Times New Roman"/>
+                <w:kern w:val="0"/>
+                <w:sz w:val="32"/>
+                <w:szCs w:val="32"/>
+                <w:lang w:eastAsia="en-IN"/>
+                <w14:ligatures w14:val="none"/>
+              </w:rPr>
+            </w:pPr>
+            <w:r>
+              <w:rPr>
+                <w:rFonts w:ascii="Times New Roman" w:eastAsia="Times New Roman" w:hAnsi="Times New Roman" w:cs="Times New Roman"/>
+                <w:kern w:val="0"/>
+                <w:sz w:val="32"/>
+                <w:szCs w:val="32"/>
+                <w:lang w:eastAsia="en-IN"/>
+                <w14:ligatures w14:val="none"/>
+              </w:rPr>
+              <w:t>Postman</w:t>
+            </w:r>
+          </w:p>
+          <w:p>
+            <w:pPr>
+              <w:spacing w:after="0" w:line="240" w:lineRule="auto"/>
+              <w:rPr>
+                <w:rFonts w:ascii="Times New Roman" w:eastAsia="Times New Roman" w:hAnsi="Times New Roman" w:cs="Times New Roman"/>
+                <w:kern w:val="0"/>
+                <w:sz w:val="32"/>
+                <w:szCs w:val="32"/>
+                <w:lang w:eastAsia="en-IN"/>
+                <w14:ligatures w14:val="none"/>
+              </w:rPr>
+            </w:pPr>
+          </w:p>
+        </w:tc>
+        <w:tc>
+          <w:tcPr>
+            <w:tcW w:w="0" w:type="auto"/>
+            <w:vAlign w:val="center"/>
+            <w:hideMark/>
+          </w:tcPr>
+          <w:p>
+            <w:pPr>
+              <w:spacing w:after="0" w:line="240" w:lineRule="auto"/>
+              <w:rPr>
+                <w:rFonts w:ascii="Times New Roman" w:eastAsia="Times New Roman" w:hAnsi="Times New Roman" w:cs="Times New Roman"/>
+                <w:kern w:val="0"/>
+                <w:sz w:val="32"/>
+                <w:szCs w:val="32"/>
+                <w:lang w:eastAsia="en-IN"/>
+                <w14:ligatures w14:val="none"/>
+              </w:rPr>
+            </w:pPr>
+            <w:r>
+              <w:rPr>
+                <w:rFonts w:ascii="Times New Roman" w:eastAsia="Times New Roman" w:hAnsi="Times New Roman" w:cs="Times New Roman"/>
+                <w:kern w:val="0"/>
+                <w:sz w:val="32"/>
+                <w:szCs w:val="32"/>
+                <w:lang w:eastAsia="en-IN"/>
+                <w14:ligatures w14:val="none"/>
+              </w:rPr>
+              <w:t>v</w:t>
+            </w:r>
+            <w:r>
+              <w:rPr>
+                <w:rFonts w:ascii="Times New Roman" w:eastAsia="Times New Roman" w:hAnsi="Times New Roman" w:cs="Times New Roman"/>
+                <w:kern w:val="0"/>
+                <w:sz w:val="32"/>
+                <w:szCs w:val="32"/>
+                <w:lang w:eastAsia="en-IN"/>
+                <w14:ligatures w14:val="none"/>
+              </w:rPr>
+              <w:t>12.15.5</w:t>
+            </w:r>
+          </w:p>
+        </w:tc>
+      </w:tr>
+    </w:tbl>
+    <w:p>
+      <w:pPr>
+        <w:spacing w:after="0" w:line="240" w:lineRule="auto"/>
+        <w:rPr>
+          <w:rFonts w:ascii="Times New Roman" w:eastAsia="Times New Roman" w:hAnsi="Times New Roman" w:cs="Times New Roman"/>
+          <w:b/>
+          <w:bCs/>
+          <w:kern w:val="0"/>
+          <w:sz w:val="40"/>
+          <w:szCs w:val="40"/>
           <w:lang w:eastAsia="en-IN"/>
           <w14:ligatures w14:val="none"/>
         </w:rPr>
@@ -850,7 +1921,31 @@
           <w:lang w:eastAsia="en-IN"/>
           <w14:ligatures w14:val="none"/>
         </w:rPr>
-        <w:t>Requirements for gym management were identified including member management, trainer management, workout programs, membership plans, and enrollments.</w:t>
+        <w:t xml:space="preserve">Requirements for gym management were identified including member management, trainer management, workout programs, membership plans, and </w:t>
+      </w:r>
+      <w:proofErr w:type="spellStart"/>
+      <w:r>
+        <w:rPr>
+          <w:rFonts w:ascii="Times New Roman" w:eastAsia="Times New Roman" w:hAnsi="Times New Roman" w:cs="Times New Roman"/>
+          <w:kern w:val="0"/>
+          <w:sz w:val="30"/>
+          <w:szCs w:val="30"/>
+          <w:lang w:eastAsia="en-IN"/>
+          <w14:ligatures w14:val="none"/>
+        </w:rPr>
+        <w:t>enrollments</w:t>
+      </w:r>
+      <w:proofErr w:type="spellEnd"/>
+      <w:r>
+        <w:rPr>
+          <w:rFonts w:ascii="Times New Roman" w:eastAsia="Times New Roman" w:hAnsi="Times New Roman" w:cs="Times New Roman"/>
+          <w:kern w:val="0"/>
+          <w:sz w:val="30"/>
+          <w:szCs w:val="30"/>
+          <w:lang w:eastAsia="en-IN"/>
+          <w14:ligatures w14:val="none"/>
+        </w:rPr>
+        <w:t>.</w:t>
       </w:r>
     </w:p>
     <w:p>
@@ -903,6 +1998,7 @@
           <w:lang w:eastAsia="en-IN"/>
           <w14:ligatures w14:val="none"/>
         </w:rPr>
+        <w:lastRenderedPageBreak/>
         <w:t>MongoDB collections were designed using Mongoose schemas.</w:t>
       </w:r>
     </w:p>
@@ -1058,6 +2154,7 @@
           <w14:ligatures w14:val="none"/>
         </w:rPr>
       </w:pPr>
+      <w:proofErr w:type="spellStart"/>
       <w:r>
         <w:rPr>
           <w:rFonts w:ascii="Times New Roman" w:eastAsia="Times New Roman" w:hAnsi="Times New Roman" w:cs="Times New Roman"/>
@@ -1069,6 +2166,7 @@
         </w:rPr>
         <w:t>Enrollments</w:t>
       </w:r>
+      <w:proofErr w:type="spellEnd"/>
     </w:p>
     <w:p>
       <w:pPr>
@@ -1172,7 +2270,6 @@
           <w:lang w:eastAsia="en-IN"/>
           <w14:ligatures w14:val="none"/>
         </w:rPr>
-        <w:lastRenderedPageBreak/>
         <w:t>Create</w:t>
       </w:r>
     </w:p>
@@ -1310,7 +2407,31 @@
           <w:lang w:eastAsia="en-IN"/>
           <w14:ligatures w14:val="none"/>
         </w:rPr>
-        <w:t>MongoDB ObjectId references were used to establish relationships.</w:t>
+        <w:t xml:space="preserve">MongoDB </w:t>
+      </w:r>
+      <w:proofErr w:type="spellStart"/>
+      <w:r>
+        <w:rPr>
+          <w:rFonts w:ascii="Times New Roman" w:eastAsia="Times New Roman" w:hAnsi="Times New Roman" w:cs="Times New Roman"/>
+          <w:kern w:val="0"/>
+          <w:sz w:val="30"/>
+          <w:szCs w:val="30"/>
+          <w:lang w:eastAsia="en-IN"/>
+          <w14:ligatures w14:val="none"/>
+        </w:rPr>
+        <w:t>ObjectId</w:t>
+      </w:r>
+      <w:proofErr w:type="spellEnd"/>
+      <w:r>
+        <w:rPr>
+          <w:rFonts w:ascii="Times New Roman" w:eastAsia="Times New Roman" w:hAnsi="Times New Roman" w:cs="Times New Roman"/>
+          <w:kern w:val="0"/>
+          <w:sz w:val="30"/>
+          <w:szCs w:val="30"/>
+          <w:lang w:eastAsia="en-IN"/>
+          <w14:ligatures w14:val="none"/>
+        </w:rPr>
+        <w:t xml:space="preserve"> references were used to establish relationships.</w:t>
       </w:r>
     </w:p>
     <w:p>
@@ -1381,16 +2502,29 @@
           <w14:ligatures w14:val="none"/>
         </w:rPr>
       </w:pPr>
-      <w:r>
-        <w:rPr>
-          <w:rFonts w:ascii="Times New Roman" w:eastAsia="Times New Roman" w:hAnsi="Times New Roman" w:cs="Times New Roman"/>
-          <w:kern w:val="0"/>
-          <w:sz w:val="30"/>
-          <w:szCs w:val="30"/>
-          <w:lang w:eastAsia="en-IN"/>
-          <w14:ligatures w14:val="none"/>
-        </w:rPr>
-        <w:t>Enrollment → Member</w:t>
+      <w:proofErr w:type="spellStart"/>
+      <w:r>
+        <w:rPr>
+          <w:rFonts w:ascii="Times New Roman" w:eastAsia="Times New Roman" w:hAnsi="Times New Roman" w:cs="Times New Roman"/>
+          <w:kern w:val="0"/>
+          <w:sz w:val="30"/>
+          <w:szCs w:val="30"/>
+          <w:lang w:eastAsia="en-IN"/>
+          <w14:ligatures w14:val="none"/>
+        </w:rPr>
+        <w:t>Enrollment</w:t>
+      </w:r>
+      <w:proofErr w:type="spellEnd"/>
+      <w:r>
+        <w:rPr>
+          <w:rFonts w:ascii="Times New Roman" w:eastAsia="Times New Roman" w:hAnsi="Times New Roman" w:cs="Times New Roman"/>
+          <w:kern w:val="0"/>
+          <w:sz w:val="30"/>
+          <w:szCs w:val="30"/>
+          <w:lang w:eastAsia="en-IN"/>
+          <w14:ligatures w14:val="none"/>
+        </w:rPr>
+        <w:t xml:space="preserve"> → Member</w:t>
       </w:r>
     </w:p>
     <w:p>
@@ -1409,16 +2543,29 @@
           <w14:ligatures w14:val="none"/>
         </w:rPr>
       </w:pPr>
-      <w:r>
-        <w:rPr>
-          <w:rFonts w:ascii="Times New Roman" w:eastAsia="Times New Roman" w:hAnsi="Times New Roman" w:cs="Times New Roman"/>
-          <w:kern w:val="0"/>
-          <w:sz w:val="30"/>
-          <w:szCs w:val="30"/>
-          <w:lang w:eastAsia="en-IN"/>
-          <w14:ligatures w14:val="none"/>
-        </w:rPr>
-        <w:t>Enrollment → Membership Plan</w:t>
+      <w:proofErr w:type="spellStart"/>
+      <w:r>
+        <w:rPr>
+          <w:rFonts w:ascii="Times New Roman" w:eastAsia="Times New Roman" w:hAnsi="Times New Roman" w:cs="Times New Roman"/>
+          <w:kern w:val="0"/>
+          <w:sz w:val="30"/>
+          <w:szCs w:val="30"/>
+          <w:lang w:eastAsia="en-IN"/>
+          <w14:ligatures w14:val="none"/>
+        </w:rPr>
+        <w:t>Enrollment</w:t>
+      </w:r>
+      <w:proofErr w:type="spellEnd"/>
+      <w:r>
+        <w:rPr>
+          <w:rFonts w:ascii="Times New Roman" w:eastAsia="Times New Roman" w:hAnsi="Times New Roman" w:cs="Times New Roman"/>
+          <w:kern w:val="0"/>
+          <w:sz w:val="30"/>
+          <w:szCs w:val="30"/>
+          <w:lang w:eastAsia="en-IN"/>
+          <w14:ligatures w14:val="none"/>
+        </w:rPr>
+        <w:t xml:space="preserve"> → Membership Plan</w:t>
       </w:r>
     </w:p>
     <w:p>
@@ -1437,16 +2584,29 @@
           <w14:ligatures w14:val="none"/>
         </w:rPr>
       </w:pPr>
-      <w:r>
-        <w:rPr>
-          <w:rFonts w:ascii="Times New Roman" w:eastAsia="Times New Roman" w:hAnsi="Times New Roman" w:cs="Times New Roman"/>
-          <w:kern w:val="0"/>
-          <w:sz w:val="30"/>
-          <w:szCs w:val="30"/>
-          <w:lang w:eastAsia="en-IN"/>
-          <w14:ligatures w14:val="none"/>
-        </w:rPr>
-        <w:t>Enrollment → Workout Program</w:t>
+      <w:proofErr w:type="spellStart"/>
+      <w:r>
+        <w:rPr>
+          <w:rFonts w:ascii="Times New Roman" w:eastAsia="Times New Roman" w:hAnsi="Times New Roman" w:cs="Times New Roman"/>
+          <w:kern w:val="0"/>
+          <w:sz w:val="30"/>
+          <w:szCs w:val="30"/>
+          <w:lang w:eastAsia="en-IN"/>
+          <w14:ligatures w14:val="none"/>
+        </w:rPr>
+        <w:t>Enrollment</w:t>
+      </w:r>
+      <w:proofErr w:type="spellEnd"/>
+      <w:r>
+        <w:rPr>
+          <w:rFonts w:ascii="Times New Roman" w:eastAsia="Times New Roman" w:hAnsi="Times New Roman" w:cs="Times New Roman"/>
+          <w:kern w:val="0"/>
+          <w:sz w:val="30"/>
+          <w:szCs w:val="30"/>
+          <w:lang w:eastAsia="en-IN"/>
+          <w14:ligatures w14:val="none"/>
+        </w:rPr>
+        <w:t xml:space="preserve"> → Workout Program</w:t>
       </w:r>
     </w:p>
     <w:p>
@@ -1756,7 +2916,6 @@
           <w:lang w:eastAsia="en-IN"/>
           <w14:ligatures w14:val="none"/>
         </w:rPr>
-        <w:lastRenderedPageBreak/>
         <w:t>6. Database Collections</w:t>
       </w:r>
     </w:p>
@@ -2196,6 +3355,7 @@
           <w:lang w:eastAsia="en-IN"/>
           <w14:ligatures w14:val="none"/>
         </w:rPr>
+        <w:lastRenderedPageBreak/>
         <w:t>Price</w:t>
       </w:r>
     </w:p>
@@ -2351,6 +3511,7 @@
           <w14:ligatures w14:val="none"/>
         </w:rPr>
       </w:pPr>
+      <w:proofErr w:type="spellStart"/>
       <w:r>
         <w:rPr>
           <w:rFonts w:ascii="Times New Roman" w:eastAsia="Times New Roman" w:hAnsi="Times New Roman" w:cs="Times New Roman"/>
@@ -2364,6 +3525,7 @@
         </w:rPr>
         <w:t>Enrollment</w:t>
       </w:r>
+      <w:proofErr w:type="spellEnd"/>
     </w:p>
     <w:p>
       <w:pPr>
@@ -2470,7 +3632,6 @@
           <w:lang w:eastAsia="en-IN"/>
           <w14:ligatures w14:val="none"/>
         </w:rPr>
-        <w:lastRenderedPageBreak/>
         <w:t>Program ID (Reference)</w:t>
       </w:r>
     </w:p>
@@ -2490,16 +3651,29 @@
           <w14:ligatures w14:val="none"/>
         </w:rPr>
       </w:pPr>
-      <w:r>
-        <w:rPr>
-          <w:rFonts w:ascii="Times New Roman" w:eastAsia="Times New Roman" w:hAnsi="Times New Roman" w:cs="Times New Roman"/>
-          <w:kern w:val="0"/>
-          <w:sz w:val="30"/>
-          <w:szCs w:val="30"/>
-          <w:lang w:eastAsia="en-IN"/>
-          <w14:ligatures w14:val="none"/>
-        </w:rPr>
-        <w:t>Enrollment Date</w:t>
+      <w:proofErr w:type="spellStart"/>
+      <w:r>
+        <w:rPr>
+          <w:rFonts w:ascii="Times New Roman" w:eastAsia="Times New Roman" w:hAnsi="Times New Roman" w:cs="Times New Roman"/>
+          <w:kern w:val="0"/>
+          <w:sz w:val="30"/>
+          <w:szCs w:val="30"/>
+          <w:lang w:eastAsia="en-IN"/>
+          <w14:ligatures w14:val="none"/>
+        </w:rPr>
+        <w:t>Enrollment</w:t>
+      </w:r>
+      <w:proofErr w:type="spellEnd"/>
+      <w:r>
+        <w:rPr>
+          <w:rFonts w:ascii="Times New Roman" w:eastAsia="Times New Roman" w:hAnsi="Times New Roman" w:cs="Times New Roman"/>
+          <w:kern w:val="0"/>
+          <w:sz w:val="30"/>
+          <w:szCs w:val="30"/>
+          <w:lang w:eastAsia="en-IN"/>
+          <w14:ligatures w14:val="none"/>
+        </w:rPr>
+        <w:t xml:space="preserve"> Date</w:t>
       </w:r>
     </w:p>
     <w:p>
@@ -2949,6 +4123,7 @@
           <w:lang w:eastAsia="en-IN"/>
           <w14:ligatures w14:val="none"/>
         </w:rPr>
+        <w:lastRenderedPageBreak/>
         <w:t>Delete Plan</w:t>
       </w:r>
     </w:p>
@@ -3174,7 +4349,31 @@
           <w:lang w:eastAsia="en-IN"/>
           <w14:ligatures w14:val="none"/>
         </w:rPr>
-        <w:t>Trainer Information using populate()</w:t>
+        <w:t xml:space="preserve">Trainer Information using </w:t>
+      </w:r>
+      <w:proofErr w:type="gramStart"/>
+      <w:r>
+        <w:rPr>
+          <w:rFonts w:ascii="Times New Roman" w:eastAsia="Times New Roman" w:hAnsi="Times New Roman" w:cs="Times New Roman"/>
+          <w:kern w:val="0"/>
+          <w:sz w:val="30"/>
+          <w:szCs w:val="30"/>
+          <w:lang w:eastAsia="en-IN"/>
+          <w14:ligatures w14:val="none"/>
+        </w:rPr>
+        <w:t>populate(</w:t>
+      </w:r>
+      <w:proofErr w:type="gramEnd"/>
+      <w:r>
+        <w:rPr>
+          <w:rFonts w:ascii="Times New Roman" w:eastAsia="Times New Roman" w:hAnsi="Times New Roman" w:cs="Times New Roman"/>
+          <w:kern w:val="0"/>
+          <w:sz w:val="30"/>
+          <w:szCs w:val="30"/>
+          <w:lang w:eastAsia="en-IN"/>
+          <w14:ligatures w14:val="none"/>
+        </w:rPr>
+        <w:t>)</w:t>
       </w:r>
     </w:p>
     <w:p>
@@ -3192,6 +4391,7 @@
           <w14:ligatures w14:val="none"/>
         </w:rPr>
       </w:pPr>
+      <w:proofErr w:type="spellStart"/>
       <w:r>
         <w:rPr>
           <w:rFonts w:ascii="Times New Roman" w:eastAsia="Times New Roman" w:hAnsi="Times New Roman" w:cs="Times New Roman"/>
@@ -3203,7 +4403,21 @@
           <w:lang w:eastAsia="en-IN"/>
           <w14:ligatures w14:val="none"/>
         </w:rPr>
-        <w:t>Enrollment Management</w:t>
+        <w:t>Enrollment</w:t>
+      </w:r>
+      <w:proofErr w:type="spellEnd"/>
+      <w:r>
+        <w:rPr>
+          <w:rFonts w:ascii="Times New Roman" w:eastAsia="Times New Roman" w:hAnsi="Times New Roman" w:cs="Times New Roman"/>
+          <w:b/>
+          <w:bCs/>
+          <w:kern w:val="0"/>
+          <w:sz w:val="40"/>
+          <w:szCs w:val="40"/>
+          <w:lang w:eastAsia="en-IN"/>
+          <w14:ligatures w14:val="none"/>
+        </w:rPr>
+        <w:t xml:space="preserve"> Management</w:t>
       </w:r>
     </w:p>
     <w:p>
@@ -3231,8 +4445,21 @@
           <w:lang w:eastAsia="en-IN"/>
           <w14:ligatures w14:val="none"/>
         </w:rPr>
-        <w:t>Add Enrollment</w:t>
-      </w:r>
+        <w:t xml:space="preserve">Add </w:t>
+      </w:r>
+      <w:proofErr w:type="spellStart"/>
+      <w:r>
+        <w:rPr>
+          <w:rFonts w:ascii="Times New Roman" w:eastAsia="Times New Roman" w:hAnsi="Times New Roman" w:cs="Times New Roman"/>
+          <w:kern w:val="0"/>
+          <w:sz w:val="30"/>
+          <w:szCs w:val="30"/>
+          <w:lang w:eastAsia="en-IN"/>
+          <w14:ligatures w14:val="none"/>
+        </w:rPr>
+        <w:t>Enrollment</w:t>
+      </w:r>
+      <w:proofErr w:type="spellEnd"/>
     </w:p>
     <w:p>
       <w:pPr>
@@ -3259,9 +4486,21 @@
           <w:lang w:eastAsia="en-IN"/>
           <w14:ligatures w14:val="none"/>
         </w:rPr>
-        <w:lastRenderedPageBreak/>
-        <w:t>View Enrollments</w:t>
-      </w:r>
+        <w:t xml:space="preserve">View </w:t>
+      </w:r>
+      <w:proofErr w:type="spellStart"/>
+      <w:r>
+        <w:rPr>
+          <w:rFonts w:ascii="Times New Roman" w:eastAsia="Times New Roman" w:hAnsi="Times New Roman" w:cs="Times New Roman"/>
+          <w:kern w:val="0"/>
+          <w:sz w:val="30"/>
+          <w:szCs w:val="30"/>
+          <w:lang w:eastAsia="en-IN"/>
+          <w14:ligatures w14:val="none"/>
+        </w:rPr>
+        <w:t>Enrollments</w:t>
+      </w:r>
+      <w:proofErr w:type="spellEnd"/>
     </w:p>
     <w:p>
       <w:pPr>
@@ -3288,8 +4527,21 @@
           <w:lang w:eastAsia="en-IN"/>
           <w14:ligatures w14:val="none"/>
         </w:rPr>
-        <w:t>Delete Enrollment</w:t>
-      </w:r>
+        <w:t xml:space="preserve">Delete </w:t>
+      </w:r>
+      <w:proofErr w:type="spellStart"/>
+      <w:r>
+        <w:rPr>
+          <w:rFonts w:ascii="Times New Roman" w:eastAsia="Times New Roman" w:hAnsi="Times New Roman" w:cs="Times New Roman"/>
+          <w:kern w:val="0"/>
+          <w:sz w:val="30"/>
+          <w:szCs w:val="30"/>
+          <w:lang w:eastAsia="en-IN"/>
+          <w14:ligatures w14:val="none"/>
+        </w:rPr>
+        <w:t>Enrollment</w:t>
+      </w:r>
+      <w:proofErr w:type="spellEnd"/>
     </w:p>
     <w:p>
       <w:pPr>
@@ -3316,7 +4568,31 @@
           <w:lang w:eastAsia="en-IN"/>
           <w14:ligatures w14:val="none"/>
         </w:rPr>
-        <w:t>Update Enrollment (via Postman)</w:t>
+        <w:t xml:space="preserve">Update </w:t>
+      </w:r>
+      <w:proofErr w:type="spellStart"/>
+      <w:r>
+        <w:rPr>
+          <w:rFonts w:ascii="Times New Roman" w:eastAsia="Times New Roman" w:hAnsi="Times New Roman" w:cs="Times New Roman"/>
+          <w:kern w:val="0"/>
+          <w:sz w:val="30"/>
+          <w:szCs w:val="30"/>
+          <w:lang w:eastAsia="en-IN"/>
+          <w14:ligatures w14:val="none"/>
+        </w:rPr>
+        <w:t>Enrollment</w:t>
+      </w:r>
+      <w:proofErr w:type="spellEnd"/>
+      <w:r>
+        <w:rPr>
+          <w:rFonts w:ascii="Times New Roman" w:eastAsia="Times New Roman" w:hAnsi="Times New Roman" w:cs="Times New Roman"/>
+          <w:kern w:val="0"/>
+          <w:sz w:val="30"/>
+          <w:szCs w:val="30"/>
+          <w:lang w:eastAsia="en-IN"/>
+          <w14:ligatures w14:val="none"/>
+        </w:rPr>
+        <w:t xml:space="preserve"> (via Postman)</w:t>
       </w:r>
     </w:p>
     <w:p>
@@ -3617,6 +4893,7 @@
           <w:lang w:eastAsia="en-IN"/>
           <w14:ligatures w14:val="none"/>
         </w:rPr>
+        <w:lastRenderedPageBreak/>
         <w:t>GET /plans</w:t>
       </w:r>
       <w:r>
@@ -3760,6 +5037,7 @@
           <w14:ligatures w14:val="none"/>
         </w:rPr>
       </w:pPr>
+      <w:proofErr w:type="spellStart"/>
       <w:r>
         <w:rPr>
           <w:rFonts w:ascii="Times New Roman" w:eastAsia="Times New Roman" w:hAnsi="Times New Roman" w:cs="Times New Roman"/>
@@ -3773,6 +5051,7 @@
         </w:rPr>
         <w:t>Enrollments</w:t>
       </w:r>
+      <w:proofErr w:type="spellEnd"/>
     </w:p>
     <w:p>
       <w:pPr>
@@ -3795,9 +5074,21 @@
           <w:lang w:eastAsia="en-IN"/>
           <w14:ligatures w14:val="none"/>
         </w:rPr>
-        <w:lastRenderedPageBreak/>
-        <w:t>GET /enrollments</w:t>
-      </w:r>
+        <w:t>GET /</w:t>
+      </w:r>
+      <w:proofErr w:type="spellStart"/>
+      <w:r>
+        <w:rPr>
+          <w:rFonts w:ascii="Times New Roman" w:eastAsia="Times New Roman" w:hAnsi="Times New Roman" w:cs="Times New Roman"/>
+          <w:kern w:val="0"/>
+          <w:sz w:val="30"/>
+          <w:szCs w:val="30"/>
+          <w:lang w:eastAsia="en-IN"/>
+          <w14:ligatures w14:val="none"/>
+        </w:rPr>
+        <w:t>enrollments</w:t>
+      </w:r>
+      <w:proofErr w:type="spellEnd"/>
       <w:r>
         <w:rPr>
           <w:rFonts w:ascii="Times New Roman" w:eastAsia="Times New Roman" w:hAnsi="Times New Roman" w:cs="Times New Roman"/>
@@ -3808,8 +5099,21 @@
           <w14:ligatures w14:val="none"/>
         </w:rPr>
         <w:br/>
-        <w:t>POST /enrollments</w:t>
-      </w:r>
+        <w:t>POST /</w:t>
+      </w:r>
+      <w:proofErr w:type="spellStart"/>
+      <w:r>
+        <w:rPr>
+          <w:rFonts w:ascii="Times New Roman" w:eastAsia="Times New Roman" w:hAnsi="Times New Roman" w:cs="Times New Roman"/>
+          <w:kern w:val="0"/>
+          <w:sz w:val="30"/>
+          <w:szCs w:val="30"/>
+          <w:lang w:eastAsia="en-IN"/>
+          <w14:ligatures w14:val="none"/>
+        </w:rPr>
+        <w:t>enrollments</w:t>
+      </w:r>
+      <w:proofErr w:type="spellEnd"/>
       <w:r>
         <w:rPr>
           <w:rFonts w:ascii="Times New Roman" w:eastAsia="Times New Roman" w:hAnsi="Times New Roman" w:cs="Times New Roman"/>
@@ -3820,7 +5124,31 @@
           <w14:ligatures w14:val="none"/>
         </w:rPr>
         <w:br/>
-        <w:t>PUT /enrollments/:id</w:t>
+        <w:t>PUT /</w:t>
+      </w:r>
+      <w:proofErr w:type="spellStart"/>
+      <w:r>
+        <w:rPr>
+          <w:rFonts w:ascii="Times New Roman" w:eastAsia="Times New Roman" w:hAnsi="Times New Roman" w:cs="Times New Roman"/>
+          <w:kern w:val="0"/>
+          <w:sz w:val="30"/>
+          <w:szCs w:val="30"/>
+          <w:lang w:eastAsia="en-IN"/>
+          <w14:ligatures w14:val="none"/>
+        </w:rPr>
+        <w:t>enrollments</w:t>
+      </w:r>
+      <w:proofErr w:type="spellEnd"/>
+      <w:r>
+        <w:rPr>
+          <w:rFonts w:ascii="Times New Roman" w:eastAsia="Times New Roman" w:hAnsi="Times New Roman" w:cs="Times New Roman"/>
+          <w:kern w:val="0"/>
+          <w:sz w:val="30"/>
+          <w:szCs w:val="30"/>
+          <w:lang w:eastAsia="en-IN"/>
+          <w14:ligatures w14:val="none"/>
+        </w:rPr>
+        <w:t>/:id</w:t>
       </w:r>
       <w:r>
         <w:rPr>
@@ -3832,7 +5160,31 @@
           <w14:ligatures w14:val="none"/>
         </w:rPr>
         <w:br/>
-        <w:t>DELETE /enrollments/:id</w:t>
+        <w:t>DELETE /</w:t>
+      </w:r>
+      <w:proofErr w:type="spellStart"/>
+      <w:r>
+        <w:rPr>
+          <w:rFonts w:ascii="Times New Roman" w:eastAsia="Times New Roman" w:hAnsi="Times New Roman" w:cs="Times New Roman"/>
+          <w:kern w:val="0"/>
+          <w:sz w:val="30"/>
+          <w:szCs w:val="30"/>
+          <w:lang w:eastAsia="en-IN"/>
+          <w14:ligatures w14:val="none"/>
+        </w:rPr>
+        <w:t>enrollments</w:t>
+      </w:r>
+      <w:proofErr w:type="spellEnd"/>
+      <w:r>
+        <w:rPr>
+          <w:rFonts w:ascii="Times New Roman" w:eastAsia="Times New Roman" w:hAnsi="Times New Roman" w:cs="Times New Roman"/>
+          <w:kern w:val="0"/>
+          <w:sz w:val="30"/>
+          <w:szCs w:val="30"/>
+          <w:lang w:eastAsia="en-IN"/>
+          <w14:ligatures w14:val="none"/>
+        </w:rPr>
+        <w:t>/:id</w:t>
       </w:r>
     </w:p>
     <w:p>
@@ -4025,6 +5377,7 @@
           <w:szCs w:val="32"/>
         </w:rPr>
       </w:pPr>
+      <w:proofErr w:type="gramStart"/>
       <w:r>
         <w:rPr>
           <w:rFonts w:ascii="Times New Roman" w:hAnsi="Times New Roman" w:cs="Times New Roman"/>
@@ -4033,6 +5386,7 @@
         </w:rPr>
         <w:t>Steps :</w:t>
       </w:r>
+      <w:proofErr w:type="gramEnd"/>
     </w:p>
     <w:p>
       <w:pPr>
@@ -4083,7 +5437,43 @@
           <w:sz w:val="32"/>
           <w:szCs w:val="32"/>
         </w:rPr>
-        <w:t xml:space="preserve"> also note that you need to connect to the 27017 port and create a db called smartgymdb in MongoDB</w:t>
+        <w:t xml:space="preserve"> also note that you need to connect to the 27017 port and create a </w:t>
+      </w:r>
+      <w:proofErr w:type="spellStart"/>
+      <w:r>
+        <w:rPr>
+          <w:rFonts w:ascii="Times New Roman" w:hAnsi="Times New Roman" w:cs="Times New Roman"/>
+          <w:sz w:val="32"/>
+          <w:szCs w:val="32"/>
+        </w:rPr>
+        <w:t>db</w:t>
+      </w:r>
+      <w:proofErr w:type="spellEnd"/>
+      <w:r>
+        <w:rPr>
+          <w:rFonts w:ascii="Times New Roman" w:hAnsi="Times New Roman" w:cs="Times New Roman"/>
+          <w:sz w:val="32"/>
+          <w:szCs w:val="32"/>
+        </w:rPr>
+        <w:t xml:space="preserve"> called </w:t>
+      </w:r>
+      <w:proofErr w:type="spellStart"/>
+      <w:r>
+        <w:rPr>
+          <w:rFonts w:ascii="Times New Roman" w:hAnsi="Times New Roman" w:cs="Times New Roman"/>
+          <w:sz w:val="32"/>
+          <w:szCs w:val="32"/>
+        </w:rPr>
+        <w:t>smartgymdb</w:t>
+      </w:r>
+      <w:proofErr w:type="spellEnd"/>
+      <w:r>
+        <w:rPr>
+          <w:rFonts w:ascii="Times New Roman" w:hAnsi="Times New Roman" w:cs="Times New Roman"/>
+          <w:sz w:val="32"/>
+          <w:szCs w:val="32"/>
+        </w:rPr>
+        <w:t xml:space="preserve"> in MongoDB</w:t>
       </w:r>
     </w:p>
     <w:p>
@@ -4127,6 +5517,7 @@
           <w:sz w:val="32"/>
           <w:szCs w:val="32"/>
         </w:rPr>
+        <w:lastRenderedPageBreak/>
         <w:t>Now the frontend is running.</w:t>
       </w:r>
     </w:p>
@@ -4179,24 +5570,77 @@
           <w:sz w:val="32"/>
           <w:szCs w:val="32"/>
         </w:rPr>
-        <w:t xml:space="preserve">While Update using the Frontend was a bit too much code so I didn’t implement it.. Update is done using postman and verified with the backend.. </w:t>
-      </w:r>
-    </w:p>
-    <w:p>
-      <w:pPr>
+        <w:t xml:space="preserve">While Update using the Frontend was a bit too much </w:t>
+      </w:r>
+      <w:proofErr w:type="gramStart"/>
+      <w:r>
         <w:rPr>
           <w:rFonts w:ascii="Times New Roman" w:hAnsi="Times New Roman" w:cs="Times New Roman"/>
           <w:sz w:val="32"/>
           <w:szCs w:val="32"/>
         </w:rPr>
-      </w:pPr>
+        <w:t>code</w:t>
+      </w:r>
+      <w:proofErr w:type="gramEnd"/>
       <w:r>
         <w:rPr>
           <w:rFonts w:ascii="Times New Roman" w:hAnsi="Times New Roman" w:cs="Times New Roman"/>
           <w:sz w:val="32"/>
           <w:szCs w:val="32"/>
         </w:rPr>
-        <w:lastRenderedPageBreak/>
+        <w:t xml:space="preserve"> so I didn’t implement </w:t>
+      </w:r>
+      <w:proofErr w:type="gramStart"/>
+      <w:r>
+        <w:rPr>
+          <w:rFonts w:ascii="Times New Roman" w:hAnsi="Times New Roman" w:cs="Times New Roman"/>
+          <w:sz w:val="32"/>
+          <w:szCs w:val="32"/>
+        </w:rPr>
+        <w:t>it..</w:t>
+      </w:r>
+      <w:proofErr w:type="gramEnd"/>
+      <w:r>
+        <w:rPr>
+          <w:rFonts w:ascii="Times New Roman" w:hAnsi="Times New Roman" w:cs="Times New Roman"/>
+          <w:sz w:val="32"/>
+          <w:szCs w:val="32"/>
+        </w:rPr>
+        <w:t xml:space="preserve"> Update is done using postman and verified with the </w:t>
+      </w:r>
+      <w:proofErr w:type="gramStart"/>
+      <w:r>
+        <w:rPr>
+          <w:rFonts w:ascii="Times New Roman" w:hAnsi="Times New Roman" w:cs="Times New Roman"/>
+          <w:sz w:val="32"/>
+          <w:szCs w:val="32"/>
+        </w:rPr>
+        <w:t>backend..</w:t>
+      </w:r>
+      <w:proofErr w:type="gramEnd"/>
+      <w:r>
+        <w:rPr>
+          <w:rFonts w:ascii="Times New Roman" w:hAnsi="Times New Roman" w:cs="Times New Roman"/>
+          <w:sz w:val="32"/>
+          <w:szCs w:val="32"/>
+        </w:rPr>
+        <w:t xml:space="preserve"> </w:t>
+      </w:r>
+    </w:p>
+    <w:p>
+      <w:pPr>
+        <w:rPr>
+          <w:rFonts w:ascii="Times New Roman" w:hAnsi="Times New Roman" w:cs="Times New Roman"/>
+          <w:sz w:val="32"/>
+          <w:szCs w:val="32"/>
+        </w:rPr>
+      </w:pPr>
+      <w:r>
+        <w:rPr>
+          <w:rFonts w:ascii="Times New Roman" w:hAnsi="Times New Roman" w:cs="Times New Roman"/>
+          <w:sz w:val="32"/>
+          <w:szCs w:val="32"/>
+        </w:rPr>
         <w:t>App.js</w:t>
       </w:r>
       <w:r>
@@ -4275,6 +5719,7 @@
           <w:sz w:val="32"/>
           <w:szCs w:val="32"/>
         </w:rPr>
+        <w:lastRenderedPageBreak/>
         <w:drawing>
           <wp:inline distT="0" distB="0" distL="0" distR="0" wp14:anchorId="3E0BD7F2" wp14:editId="67683D9F">
             <wp:extent cx="5731510" cy="2779395"/>
@@ -4357,9 +5802,8 @@
           <w:sz w:val="32"/>
           <w:szCs w:val="32"/>
         </w:rPr>
-        <w:lastRenderedPageBreak/>
         <w:drawing>
-          <wp:inline distT="0" distB="0" distL="0" distR="0" wp14:anchorId="2510ED62" wp14:editId="4FDD6C16">
+          <wp:inline distT="0" distB="0" distL="0" distR="0" wp14:anchorId="2510ED62" wp14:editId="6F2E656D">
             <wp:extent cx="5731510" cy="2773045"/>
             <wp:effectExtent l="0" t="0" r="2540" b="8255"/>
             <wp:docPr id="996367726" name="Picture 2"/>
@@ -4422,7 +5866,43 @@
           <w:sz w:val="32"/>
           <w:szCs w:val="32"/>
         </w:rPr>
-        <w:t xml:space="preserve">When clicked on the member Card : We can see all the members and Add new + </w:t>
+        <w:t xml:space="preserve">When clicked on the member </w:t>
+      </w:r>
+      <w:proofErr w:type="gramStart"/>
+      <w:r>
+        <w:rPr>
+          <w:rFonts w:ascii="Times New Roman" w:hAnsi="Times New Roman" w:cs="Times New Roman"/>
+          <w:sz w:val="32"/>
+          <w:szCs w:val="32"/>
+        </w:rPr>
+        <w:t>Card :</w:t>
+      </w:r>
+      <w:proofErr w:type="gramEnd"/>
+      <w:r>
+        <w:rPr>
+          <w:rFonts w:ascii="Times New Roman" w:hAnsi="Times New Roman" w:cs="Times New Roman"/>
+          <w:sz w:val="32"/>
+          <w:szCs w:val="32"/>
+        </w:rPr>
+        <w:t xml:space="preserve"> We can see all the members and </w:t>
+      </w:r>
+      <w:proofErr w:type="gramStart"/>
+      <w:r>
+        <w:rPr>
+          <w:rFonts w:ascii="Times New Roman" w:hAnsi="Times New Roman" w:cs="Times New Roman"/>
+          <w:sz w:val="32"/>
+          <w:szCs w:val="32"/>
+        </w:rPr>
+        <w:t>Add</w:t>
+      </w:r>
+      <w:proofErr w:type="gramEnd"/>
+      <w:r>
+        <w:rPr>
+          <w:rFonts w:ascii="Times New Roman" w:hAnsi="Times New Roman" w:cs="Times New Roman"/>
+          <w:sz w:val="32"/>
+          <w:szCs w:val="32"/>
+        </w:rPr>
+        <w:t xml:space="preserve"> new + </w:t>
       </w:r>
       <w:r>
         <w:rPr>
@@ -4449,6 +5929,7 @@
           <w:sz w:val="32"/>
           <w:szCs w:val="32"/>
         </w:rPr>
+        <w:lastRenderedPageBreak/>
         <w:drawing>
           <wp:inline distT="0" distB="0" distL="0" distR="0" wp14:anchorId="71007C8C" wp14:editId="3AB6FA40">
             <wp:extent cx="5731510" cy="2769870"/>
@@ -4513,9 +5994,18 @@
           <w:sz w:val="32"/>
           <w:szCs w:val="32"/>
         </w:rPr>
-        <w:lastRenderedPageBreak/>
-        <w:t>Adding a new member :</w:t>
-      </w:r>
+        <w:t xml:space="preserve">Adding a new </w:t>
+      </w:r>
+      <w:proofErr w:type="gramStart"/>
+      <w:r>
+        <w:rPr>
+          <w:rFonts w:ascii="Times New Roman" w:hAnsi="Times New Roman" w:cs="Times New Roman"/>
+          <w:sz w:val="32"/>
+          <w:szCs w:val="32"/>
+        </w:rPr>
+        <w:t>member :</w:t>
+      </w:r>
+      <w:proofErr w:type="gramEnd"/>
       <w:r>
         <w:rPr>
           <w:rFonts w:ascii="Times New Roman" w:hAnsi="Times New Roman" w:cs="Times New Roman"/>
@@ -4587,7 +6077,25 @@
           <w:sz w:val="32"/>
           <w:szCs w:val="32"/>
         </w:rPr>
-        <w:t>After adding New member:</w:t>
+        <w:t xml:space="preserve">After adding </w:t>
+      </w:r>
+      <w:proofErr w:type="gramStart"/>
+      <w:r>
+        <w:rPr>
+          <w:rFonts w:ascii="Times New Roman" w:hAnsi="Times New Roman" w:cs="Times New Roman"/>
+          <w:sz w:val="32"/>
+          <w:szCs w:val="32"/>
+        </w:rPr>
+        <w:t>New</w:t>
+      </w:r>
+      <w:proofErr w:type="gramEnd"/>
+      <w:r>
+        <w:rPr>
+          <w:rFonts w:ascii="Times New Roman" w:hAnsi="Times New Roman" w:cs="Times New Roman"/>
+          <w:sz w:val="32"/>
+          <w:szCs w:val="32"/>
+        </w:rPr>
+        <w:t xml:space="preserve"> member:</w:t>
       </w:r>
     </w:p>
     <w:p>
@@ -4605,6 +6113,7 @@
           <w:sz w:val="32"/>
           <w:szCs w:val="32"/>
         </w:rPr>
+        <w:lastRenderedPageBreak/>
         <w:drawing>
           <wp:inline distT="0" distB="0" distL="0" distR="0" wp14:anchorId="577B4C3D" wp14:editId="3028A6BD">
             <wp:extent cx="5731510" cy="2779395"/>
@@ -4669,7 +6178,6 @@
           <w:sz w:val="32"/>
           <w:szCs w:val="32"/>
         </w:rPr>
-        <w:lastRenderedPageBreak/>
         <w:t>Trainer Card Clicked – same layout (add/delete)</w:t>
       </w:r>
       <w:r>
@@ -4752,6 +6260,7 @@
           <w:sz w:val="32"/>
           <w:szCs w:val="32"/>
         </w:rPr>
+        <w:lastRenderedPageBreak/>
         <w:drawing>
           <wp:inline distT="0" distB="0" distL="0" distR="0" wp14:anchorId="1DF58013" wp14:editId="6E3F0D6D">
             <wp:extent cx="5731510" cy="2919730"/>
@@ -4816,8 +6325,18 @@
           <w:sz w:val="32"/>
           <w:szCs w:val="32"/>
         </w:rPr>
-        <w:t>After Adding new Trainer :</w:t>
-      </w:r>
+        <w:t xml:space="preserve">After Adding new </w:t>
+      </w:r>
+      <w:proofErr w:type="gramStart"/>
+      <w:r>
+        <w:rPr>
+          <w:rFonts w:ascii="Times New Roman" w:hAnsi="Times New Roman" w:cs="Times New Roman"/>
+          <w:sz w:val="32"/>
+          <w:szCs w:val="32"/>
+        </w:rPr>
+        <w:t>Trainer :</w:t>
+      </w:r>
+      <w:proofErr w:type="gramEnd"/>
     </w:p>
     <w:p>
       <w:pPr>
@@ -4834,7 +6353,6 @@
           <w:sz w:val="32"/>
           <w:szCs w:val="32"/>
         </w:rPr>
-        <w:lastRenderedPageBreak/>
         <w:drawing>
           <wp:inline distT="0" distB="0" distL="0" distR="0" wp14:anchorId="03F2F51B" wp14:editId="1AB1AC82">
             <wp:extent cx="5731510" cy="2780665"/>
@@ -4917,6 +6435,7 @@
           <w:sz w:val="32"/>
           <w:szCs w:val="32"/>
         </w:rPr>
+        <w:lastRenderedPageBreak/>
         <w:drawing>
           <wp:inline distT="0" distB="0" distL="0" distR="0" wp14:anchorId="2D33A456" wp14:editId="3134380E">
             <wp:extent cx="5731510" cy="2997200"/>
@@ -4981,8 +6500,36 @@
           <w:sz w:val="32"/>
           <w:szCs w:val="32"/>
         </w:rPr>
-        <w:t>After adding New plan :</w:t>
-      </w:r>
+        <w:t xml:space="preserve">After adding </w:t>
+      </w:r>
+      <w:proofErr w:type="gramStart"/>
+      <w:r>
+        <w:rPr>
+          <w:rFonts w:ascii="Times New Roman" w:hAnsi="Times New Roman" w:cs="Times New Roman"/>
+          <w:sz w:val="32"/>
+          <w:szCs w:val="32"/>
+        </w:rPr>
+        <w:t>New</w:t>
+      </w:r>
+      <w:proofErr w:type="gramEnd"/>
+      <w:r>
+        <w:rPr>
+          <w:rFonts w:ascii="Times New Roman" w:hAnsi="Times New Roman" w:cs="Times New Roman"/>
+          <w:sz w:val="32"/>
+          <w:szCs w:val="32"/>
+        </w:rPr>
+        <w:t xml:space="preserve"> </w:t>
+      </w:r>
+      <w:proofErr w:type="gramStart"/>
+      <w:r>
+        <w:rPr>
+          <w:rFonts w:ascii="Times New Roman" w:hAnsi="Times New Roman" w:cs="Times New Roman"/>
+          <w:sz w:val="32"/>
+          <w:szCs w:val="32"/>
+        </w:rPr>
+        <w:t>plan :</w:t>
+      </w:r>
+      <w:proofErr w:type="gramEnd"/>
     </w:p>
     <w:p>
       <w:pPr>
@@ -4999,7 +6546,6 @@
           <w:sz w:val="32"/>
           <w:szCs w:val="32"/>
         </w:rPr>
-        <w:lastRenderedPageBreak/>
         <w:drawing>
           <wp:inline distT="0" distB="0" distL="0" distR="0" wp14:anchorId="3B574F7F" wp14:editId="1F918FE2">
             <wp:extent cx="5731510" cy="2743200"/>
@@ -5082,7 +6628,79 @@
           <w:sz w:val="32"/>
           <w:szCs w:val="32"/>
         </w:rPr>
-        <w:t>Workout programs – also I have added a drop down menu as we need to enter the product so I used POPULATE to get the id in a drop down menu…(Also auto update as we enter new)</w:t>
+        <w:t xml:space="preserve">Workout programs – also I have added a </w:t>
+      </w:r>
+      <w:proofErr w:type="gramStart"/>
+      <w:r>
+        <w:rPr>
+          <w:rFonts w:ascii="Times New Roman" w:hAnsi="Times New Roman" w:cs="Times New Roman"/>
+          <w:sz w:val="32"/>
+          <w:szCs w:val="32"/>
+        </w:rPr>
+        <w:t>drop down</w:t>
+      </w:r>
+      <w:proofErr w:type="gramEnd"/>
+      <w:r>
+        <w:rPr>
+          <w:rFonts w:ascii="Times New Roman" w:hAnsi="Times New Roman" w:cs="Times New Roman"/>
+          <w:sz w:val="32"/>
+          <w:szCs w:val="32"/>
+        </w:rPr>
+        <w:t xml:space="preserve"> menu as we need to enter the </w:t>
+      </w:r>
+      <w:proofErr w:type="gramStart"/>
+      <w:r>
+        <w:rPr>
+          <w:rFonts w:ascii="Times New Roman" w:hAnsi="Times New Roman" w:cs="Times New Roman"/>
+          <w:sz w:val="32"/>
+          <w:szCs w:val="32"/>
+        </w:rPr>
+        <w:t>product</w:t>
+      </w:r>
+      <w:proofErr w:type="gramEnd"/>
+      <w:r>
+        <w:rPr>
+          <w:rFonts w:ascii="Times New Roman" w:hAnsi="Times New Roman" w:cs="Times New Roman"/>
+          <w:sz w:val="32"/>
+          <w:szCs w:val="32"/>
+        </w:rPr>
+        <w:t xml:space="preserve"> so I used POPULATE to get the id in a </w:t>
+      </w:r>
+      <w:proofErr w:type="gramStart"/>
+      <w:r>
+        <w:rPr>
+          <w:rFonts w:ascii="Times New Roman" w:hAnsi="Times New Roman" w:cs="Times New Roman"/>
+          <w:sz w:val="32"/>
+          <w:szCs w:val="32"/>
+        </w:rPr>
+        <w:t>drop down</w:t>
+      </w:r>
+      <w:proofErr w:type="gramEnd"/>
+      <w:r>
+        <w:rPr>
+          <w:rFonts w:ascii="Times New Roman" w:hAnsi="Times New Roman" w:cs="Times New Roman"/>
+          <w:sz w:val="32"/>
+          <w:szCs w:val="32"/>
+        </w:rPr>
+        <w:t xml:space="preserve"> menu</w:t>
+      </w:r>
+      <w:proofErr w:type="gramStart"/>
+      <w:r>
+        <w:rPr>
+          <w:rFonts w:ascii="Times New Roman" w:hAnsi="Times New Roman" w:cs="Times New Roman"/>
+          <w:sz w:val="32"/>
+          <w:szCs w:val="32"/>
+        </w:rPr>
+        <w:t>…(</w:t>
+      </w:r>
+      <w:proofErr w:type="gramEnd"/>
+      <w:r>
+        <w:rPr>
+          <w:rFonts w:ascii="Times New Roman" w:hAnsi="Times New Roman" w:cs="Times New Roman"/>
+          <w:sz w:val="32"/>
+          <w:szCs w:val="32"/>
+        </w:rPr>
+        <w:t>Also auto update as we enter new)</w:t>
       </w:r>
     </w:p>
     <w:p>
@@ -5109,8 +6727,9 @@
           <w:sz w:val="32"/>
           <w:szCs w:val="32"/>
         </w:rPr>
+        <w:lastRenderedPageBreak/>
         <w:drawing>
-          <wp:inline distT="0" distB="0" distL="0" distR="0" wp14:anchorId="2E49954A" wp14:editId="078D3957">
+          <wp:inline distT="0" distB="0" distL="0" distR="0" wp14:anchorId="2E49954A" wp14:editId="6BF9F4BA">
             <wp:extent cx="5731510" cy="2769870"/>
             <wp:effectExtent l="0" t="0" r="2540" b="0"/>
             <wp:docPr id="2013823525" name="Picture 11"/>
@@ -5191,9 +6810,8 @@
           <w:sz w:val="32"/>
           <w:szCs w:val="32"/>
         </w:rPr>
-        <w:lastRenderedPageBreak/>
         <w:drawing>
-          <wp:inline distT="0" distB="0" distL="0" distR="0" wp14:anchorId="523126B2" wp14:editId="40AB529D">
+          <wp:inline distT="0" distB="0" distL="0" distR="0" wp14:anchorId="523126B2" wp14:editId="0906FBE3">
             <wp:extent cx="5731510" cy="2773045"/>
             <wp:effectExtent l="0" t="0" r="2540" b="8255"/>
             <wp:docPr id="918694848" name="Picture 12"/>
@@ -5256,7 +6874,25 @@
           <w:sz w:val="32"/>
           <w:szCs w:val="32"/>
         </w:rPr>
-        <w:t xml:space="preserve">We can Add and delete enrolments as well .. </w:t>
+        <w:t>We can Add and delete enrolments as well</w:t>
+      </w:r>
+      <w:proofErr w:type="gramStart"/>
+      <w:r>
+        <w:rPr>
+          <w:rFonts w:ascii="Times New Roman" w:hAnsi="Times New Roman" w:cs="Times New Roman"/>
+          <w:sz w:val="32"/>
+          <w:szCs w:val="32"/>
+        </w:rPr>
+        <w:t xml:space="preserve"> ..</w:t>
+      </w:r>
+      <w:proofErr w:type="gramEnd"/>
+      <w:r>
+        <w:rPr>
+          <w:rFonts w:ascii="Times New Roman" w:hAnsi="Times New Roman" w:cs="Times New Roman"/>
+          <w:sz w:val="32"/>
+          <w:szCs w:val="32"/>
+        </w:rPr>
+        <w:t xml:space="preserve"> </w:t>
       </w:r>
     </w:p>
     <w:p>
@@ -5274,8 +6910,9 @@
           <w:sz w:val="32"/>
           <w:szCs w:val="32"/>
         </w:rPr>
+        <w:lastRenderedPageBreak/>
         <w:drawing>
-          <wp:inline distT="0" distB="0" distL="0" distR="0" wp14:anchorId="014CB2D1" wp14:editId="226CBD6A">
+          <wp:inline distT="0" distB="0" distL="0" distR="0" wp14:anchorId="014CB2D1" wp14:editId="6B71D50B">
             <wp:extent cx="5731510" cy="2695575"/>
             <wp:effectExtent l="0" t="0" r="2540" b="9525"/>
             <wp:docPr id="1715155349" name="Picture 13"/>
@@ -5365,7 +7002,6 @@
           <w:sz w:val="32"/>
           <w:szCs w:val="32"/>
         </w:rPr>
-        <w:lastRenderedPageBreak/>
         <w:drawing>
           <wp:inline distT="0" distB="0" distL="0" distR="0" wp14:anchorId="74B09D24" wp14:editId="368966F0">
             <wp:extent cx="5731510" cy="3048000"/>
@@ -5431,6 +7067,7 @@
           <w:sz w:val="32"/>
           <w:szCs w:val="32"/>
         </w:rPr>
+        <w:lastRenderedPageBreak/>
         <w:drawing>
           <wp:inline distT="0" distB="0" distL="0" distR="0" wp14:anchorId="503EDE94" wp14:editId="16EDA1FE">
             <wp:extent cx="5731510" cy="3027045"/>
@@ -5504,7 +7141,43 @@
           <w:sz w:val="32"/>
           <w:szCs w:val="32"/>
         </w:rPr>
-        <w:t xml:space="preserve">After Deleting of the records .. auto updated the cards .. </w:t>
+        <w:t>After Deleting of the records</w:t>
+      </w:r>
+      <w:proofErr w:type="gramStart"/>
+      <w:r>
+        <w:rPr>
+          <w:rFonts w:ascii="Times New Roman" w:hAnsi="Times New Roman" w:cs="Times New Roman"/>
+          <w:sz w:val="32"/>
+          <w:szCs w:val="32"/>
+        </w:rPr>
+        <w:t xml:space="preserve"> ..</w:t>
+      </w:r>
+      <w:proofErr w:type="gramEnd"/>
+      <w:r>
+        <w:rPr>
+          <w:rFonts w:ascii="Times New Roman" w:hAnsi="Times New Roman" w:cs="Times New Roman"/>
+          <w:sz w:val="32"/>
+          <w:szCs w:val="32"/>
+        </w:rPr>
+        <w:t xml:space="preserve"> auto updated the cards</w:t>
+      </w:r>
+      <w:proofErr w:type="gramStart"/>
+      <w:r>
+        <w:rPr>
+          <w:rFonts w:ascii="Times New Roman" w:hAnsi="Times New Roman" w:cs="Times New Roman"/>
+          <w:sz w:val="32"/>
+          <w:szCs w:val="32"/>
+        </w:rPr>
+        <w:t xml:space="preserve"> ..</w:t>
+      </w:r>
+      <w:proofErr w:type="gramEnd"/>
+      <w:r>
+        <w:rPr>
+          <w:rFonts w:ascii="Times New Roman" w:hAnsi="Times New Roman" w:cs="Times New Roman"/>
+          <w:sz w:val="32"/>
+          <w:szCs w:val="32"/>
+        </w:rPr>
+        <w:t xml:space="preserve"> </w:t>
       </w:r>
     </w:p>
     <w:p>
@@ -5522,7 +7195,6 @@
           <w:sz w:val="32"/>
           <w:szCs w:val="32"/>
         </w:rPr>
-        <w:lastRenderedPageBreak/>
         <w:drawing>
           <wp:inline distT="0" distB="0" distL="0" distR="0" wp14:anchorId="356C5907" wp14:editId="18A02D86">
             <wp:extent cx="5731510" cy="2764155"/>
@@ -5574,34 +7246,36 @@
           <w:sz w:val="32"/>
           <w:szCs w:val="32"/>
         </w:rPr>
-        <w:t>Update Didn’t implement in the Website as frontend was complicated… :</w:t>
-      </w:r>
-    </w:p>
-    <w:p>
-      <w:pPr>
+        <w:t xml:space="preserve">Update Didn’t implement </w:t>
+      </w:r>
+      <w:proofErr w:type="gramStart"/>
+      <w:r>
         <w:rPr>
           <w:rFonts w:ascii="Times New Roman" w:hAnsi="Times New Roman" w:cs="Times New Roman"/>
           <w:sz w:val="32"/>
           <w:szCs w:val="32"/>
         </w:rPr>
-      </w:pPr>
-    </w:p>
-    <w:p>
-      <w:pPr>
+        <w:t>in</w:t>
+      </w:r>
+      <w:proofErr w:type="gramEnd"/>
+      <w:r>
         <w:rPr>
           <w:rFonts w:ascii="Times New Roman" w:hAnsi="Times New Roman" w:cs="Times New Roman"/>
           <w:sz w:val="32"/>
           <w:szCs w:val="32"/>
         </w:rPr>
-      </w:pPr>
+        <w:t xml:space="preserve"> the Website as frontend was complicated</w:t>
+      </w:r>
+      <w:proofErr w:type="gramStart"/>
       <w:r>
         <w:rPr>
           <w:rFonts w:ascii="Times New Roman" w:hAnsi="Times New Roman" w:cs="Times New Roman"/>
           <w:sz w:val="32"/>
           <w:szCs w:val="32"/>
         </w:rPr>
-        <w:t>Update done using PostMan:</w:t>
-      </w:r>
+        <w:t>… :</w:t>
+      </w:r>
+      <w:proofErr w:type="gramEnd"/>
     </w:p>
     <w:p>
       <w:pPr>
@@ -5611,12 +7285,57 @@
           <w:szCs w:val="32"/>
         </w:rPr>
       </w:pPr>
-      <w:r>
+    </w:p>
+    <w:p>
+      <w:pPr>
         <w:rPr>
           <w:rFonts w:ascii="Times New Roman" w:hAnsi="Times New Roman" w:cs="Times New Roman"/>
           <w:sz w:val="32"/>
           <w:szCs w:val="32"/>
         </w:rPr>
+      </w:pPr>
+      <w:r>
+        <w:rPr>
+          <w:rFonts w:ascii="Times New Roman" w:hAnsi="Times New Roman" w:cs="Times New Roman"/>
+          <w:sz w:val="32"/>
+          <w:szCs w:val="32"/>
+        </w:rPr>
+        <w:t xml:space="preserve">Update done using </w:t>
+      </w:r>
+      <w:proofErr w:type="spellStart"/>
+      <w:r>
+        <w:rPr>
+          <w:rFonts w:ascii="Times New Roman" w:hAnsi="Times New Roman" w:cs="Times New Roman"/>
+          <w:sz w:val="32"/>
+          <w:szCs w:val="32"/>
+        </w:rPr>
+        <w:t>PostMan</w:t>
+      </w:r>
+      <w:proofErr w:type="spellEnd"/>
+      <w:r>
+        <w:rPr>
+          <w:rFonts w:ascii="Times New Roman" w:hAnsi="Times New Roman" w:cs="Times New Roman"/>
+          <w:sz w:val="32"/>
+          <w:szCs w:val="32"/>
+        </w:rPr>
+        <w:t>:</w:t>
+      </w:r>
+    </w:p>
+    <w:p>
+      <w:pPr>
+        <w:rPr>
+          <w:rFonts w:ascii="Times New Roman" w:hAnsi="Times New Roman" w:cs="Times New Roman"/>
+          <w:sz w:val="32"/>
+          <w:szCs w:val="32"/>
+        </w:rPr>
+      </w:pPr>
+      <w:r>
+        <w:rPr>
+          <w:rFonts w:ascii="Times New Roman" w:hAnsi="Times New Roman" w:cs="Times New Roman"/>
+          <w:sz w:val="32"/>
+          <w:szCs w:val="32"/>
+        </w:rPr>
+        <w:lastRenderedPageBreak/>
         <w:br/>
       </w:r>
       <w:r>
@@ -5678,7 +7397,6 @@
           <w:sz w:val="32"/>
           <w:szCs w:val="32"/>
         </w:rPr>
-        <w:lastRenderedPageBreak/>
         <w:drawing>
           <wp:inline distT="0" distB="0" distL="0" distR="0" wp14:anchorId="2752FF01" wp14:editId="360D9484">
             <wp:extent cx="5731510" cy="2668270"/>
@@ -5783,6 +7501,7 @@
           <w:sz w:val="32"/>
           <w:szCs w:val="32"/>
         </w:rPr>
+        <w:lastRenderedPageBreak/>
         <w:drawing>
           <wp:inline distT="0" distB="0" distL="0" distR="0" wp14:anchorId="7960A3DF" wp14:editId="0B7B93D5">
             <wp:extent cx="5731510" cy="2725420"/>
@@ -5835,7 +7554,6 @@
           <w:sz w:val="32"/>
           <w:szCs w:val="32"/>
         </w:rPr>
-        <w:lastRenderedPageBreak/>
         <w:drawing>
           <wp:inline distT="0" distB="0" distL="0" distR="0" wp14:anchorId="1EE3028F" wp14:editId="05E5F9ED">
             <wp:extent cx="5731510" cy="3221355"/>
@@ -5932,6 +7650,7 @@
           <w:sz w:val="32"/>
           <w:szCs w:val="32"/>
         </w:rPr>
+        <w:lastRenderedPageBreak/>
         <w:drawing>
           <wp:inline distT="0" distB="0" distL="0" distR="0" wp14:anchorId="62B1A1A2" wp14:editId="5392A7F4">
             <wp:extent cx="5731510" cy="2833370"/>
@@ -5984,7 +7703,6 @@
           <w:sz w:val="32"/>
           <w:szCs w:val="32"/>
         </w:rPr>
-        <w:lastRenderedPageBreak/>
         <w:drawing>
           <wp:inline distT="0" distB="0" distL="0" distR="0" wp14:anchorId="3C422F41" wp14:editId="521BB4DE">
             <wp:extent cx="5731510" cy="3099435"/>
@@ -6037,6 +7755,7 @@
           <w:sz w:val="32"/>
           <w:szCs w:val="32"/>
         </w:rPr>
+        <w:lastRenderedPageBreak/>
         <w:drawing>
           <wp:inline distT="0" distB="0" distL="0" distR="0" wp14:anchorId="0BF683D7" wp14:editId="0B2C84C2">
             <wp:extent cx="5731510" cy="3033395"/>
@@ -6264,6 +7983,19 @@
         </w:rPr>
         <w:t>10. Results</w:t>
       </w:r>
+      <w:r>
+        <w:rPr>
+          <w:rFonts w:ascii="Times New Roman" w:eastAsia="Times New Roman" w:hAnsi="Times New Roman" w:cs="Times New Roman"/>
+          <w:b/>
+          <w:bCs/>
+          <w:kern w:val="0"/>
+          <w:sz w:val="40"/>
+          <w:szCs w:val="40"/>
+          <w:lang w:eastAsia="en-IN"/>
+          <w14:ligatures w14:val="none"/>
+        </w:rPr>
+        <w:t xml:space="preserve"> and Summary</w:t>
+      </w:r>
     </w:p>
     <w:p>
       <w:pPr>
@@ -6417,16 +8149,29 @@
           <w14:ligatures w14:val="none"/>
         </w:rPr>
       </w:pPr>
-      <w:r>
-        <w:rPr>
-          <w:rFonts w:ascii="Times New Roman" w:eastAsia="Times New Roman" w:hAnsi="Times New Roman" w:cs="Times New Roman"/>
-          <w:kern w:val="0"/>
-          <w:sz w:val="30"/>
-          <w:szCs w:val="30"/>
-          <w:lang w:eastAsia="en-IN"/>
-          <w14:ligatures w14:val="none"/>
-        </w:rPr>
-        <w:t>Enrollment Management</w:t>
+      <w:proofErr w:type="spellStart"/>
+      <w:r>
+        <w:rPr>
+          <w:rFonts w:ascii="Times New Roman" w:eastAsia="Times New Roman" w:hAnsi="Times New Roman" w:cs="Times New Roman"/>
+          <w:kern w:val="0"/>
+          <w:sz w:val="30"/>
+          <w:szCs w:val="30"/>
+          <w:lang w:eastAsia="en-IN"/>
+          <w14:ligatures w14:val="none"/>
+        </w:rPr>
+        <w:t>Enrollment</w:t>
+      </w:r>
+      <w:proofErr w:type="spellEnd"/>
+      <w:r>
+        <w:rPr>
+          <w:rFonts w:ascii="Times New Roman" w:eastAsia="Times New Roman" w:hAnsi="Times New Roman" w:cs="Times New Roman"/>
+          <w:kern w:val="0"/>
+          <w:sz w:val="30"/>
+          <w:szCs w:val="30"/>
+          <w:lang w:eastAsia="en-IN"/>
+          <w14:ligatures w14:val="none"/>
+        </w:rPr>
+        <w:t xml:space="preserve"> Management</w:t>
       </w:r>
     </w:p>
     <w:p>
@@ -6512,7 +8257,101 @@
     <w:p>
       <w:pPr>
         <w:spacing w:before="100" w:beforeAutospacing="1" w:after="100" w:afterAutospacing="1" w:line="240" w:lineRule="auto"/>
-        <w:outlineLvl w:val="1"/>
+        <w:rPr>
+          <w:rFonts w:ascii="Times New Roman" w:eastAsia="Times New Roman" w:hAnsi="Times New Roman" w:cs="Times New Roman"/>
+          <w:kern w:val="0"/>
+          <w:sz w:val="30"/>
+          <w:szCs w:val="30"/>
+          <w:lang w:eastAsia="en-IN"/>
+          <w14:ligatures w14:val="none"/>
+        </w:rPr>
+      </w:pPr>
+      <w:r>
+        <w:rPr>
+          <w:rFonts w:ascii="Times New Roman" w:eastAsia="Times New Roman" w:hAnsi="Times New Roman" w:cs="Times New Roman"/>
+          <w:kern w:val="0"/>
+          <w:sz w:val="30"/>
+          <w:szCs w:val="30"/>
+          <w:lang w:eastAsia="en-IN"/>
+          <w14:ligatures w14:val="none"/>
+        </w:rPr>
+        <w:t xml:space="preserve">Gym Hub is a web-based gym management solution developed using Node.js, Express.js, MongoDB, and JavaScript. The system integrates five major modules: Members, Trainers, Membership Plans, Workout Programs, and </w:t>
+      </w:r>
+      <w:proofErr w:type="spellStart"/>
+      <w:r>
+        <w:rPr>
+          <w:rFonts w:ascii="Times New Roman" w:eastAsia="Times New Roman" w:hAnsi="Times New Roman" w:cs="Times New Roman"/>
+          <w:kern w:val="0"/>
+          <w:sz w:val="30"/>
+          <w:szCs w:val="30"/>
+          <w:lang w:eastAsia="en-IN"/>
+          <w14:ligatures w14:val="none"/>
+        </w:rPr>
+        <w:t>Enrollments</w:t>
+      </w:r>
+      <w:proofErr w:type="spellEnd"/>
+      <w:r>
+        <w:rPr>
+          <w:rFonts w:ascii="Times New Roman" w:eastAsia="Times New Roman" w:hAnsi="Times New Roman" w:cs="Times New Roman"/>
+          <w:kern w:val="0"/>
+          <w:sz w:val="30"/>
+          <w:szCs w:val="30"/>
+          <w:lang w:eastAsia="en-IN"/>
+          <w14:ligatures w14:val="none"/>
+        </w:rPr>
+        <w:t xml:space="preserve">. MongoDB </w:t>
+      </w:r>
+      <w:proofErr w:type="spellStart"/>
+      <w:r>
+        <w:rPr>
+          <w:rFonts w:ascii="Times New Roman" w:eastAsia="Times New Roman" w:hAnsi="Times New Roman" w:cs="Times New Roman"/>
+          <w:kern w:val="0"/>
+          <w:sz w:val="30"/>
+          <w:szCs w:val="30"/>
+          <w:lang w:eastAsia="en-IN"/>
+          <w14:ligatures w14:val="none"/>
+        </w:rPr>
+        <w:t>ObjectId</w:t>
+      </w:r>
+      <w:proofErr w:type="spellEnd"/>
+      <w:r>
+        <w:rPr>
+          <w:rFonts w:ascii="Times New Roman" w:eastAsia="Times New Roman" w:hAnsi="Times New Roman" w:cs="Times New Roman"/>
+          <w:kern w:val="0"/>
+          <w:sz w:val="30"/>
+          <w:szCs w:val="30"/>
+          <w:lang w:eastAsia="en-IN"/>
+          <w14:ligatures w14:val="none"/>
+        </w:rPr>
+        <w:t xml:space="preserve"> references and Mongoose </w:t>
+      </w:r>
+      <w:proofErr w:type="gramStart"/>
+      <w:r>
+        <w:rPr>
+          <w:rFonts w:ascii="Times New Roman" w:eastAsia="Times New Roman" w:hAnsi="Times New Roman" w:cs="Times New Roman"/>
+          <w:kern w:val="0"/>
+          <w:sz w:val="30"/>
+          <w:szCs w:val="30"/>
+          <w:lang w:eastAsia="en-IN"/>
+          <w14:ligatures w14:val="none"/>
+        </w:rPr>
+        <w:t>populate(</w:t>
+      </w:r>
+      <w:proofErr w:type="gramEnd"/>
+      <w:r>
+        <w:rPr>
+          <w:rFonts w:ascii="Times New Roman" w:eastAsia="Times New Roman" w:hAnsi="Times New Roman" w:cs="Times New Roman"/>
+          <w:kern w:val="0"/>
+          <w:sz w:val="30"/>
+          <w:szCs w:val="30"/>
+          <w:lang w:eastAsia="en-IN"/>
+          <w14:ligatures w14:val="none"/>
+        </w:rPr>
+        <w:t>) were used to manage and display related data efficiently. The project demonstrates practical implementation of database management, RESTful APIs, frontend-backend integration, and CRUD operations.</w:t>
+      </w:r>
+    </w:p>
+    <w:p>
+      <w:pPr>
         <w:rPr>
           <w:rFonts w:ascii="Times New Roman" w:eastAsia="Times New Roman" w:hAnsi="Times New Roman" w:cs="Times New Roman"/>
           <w:b/>
@@ -6535,6 +8374,36 @@
           <w:lang w:eastAsia="en-IN"/>
           <w14:ligatures w14:val="none"/>
         </w:rPr>
+        <w:br w:type="page"/>
+      </w:r>
+    </w:p>
+    <w:p>
+      <w:pPr>
+        <w:spacing w:before="100" w:beforeAutospacing="1" w:after="100" w:afterAutospacing="1" w:line="240" w:lineRule="auto"/>
+        <w:outlineLvl w:val="1"/>
+        <w:rPr>
+          <w:rFonts w:ascii="Times New Roman" w:eastAsia="Times New Roman" w:hAnsi="Times New Roman" w:cs="Times New Roman"/>
+          <w:b/>
+          <w:bCs/>
+          <w:kern w:val="0"/>
+          <w:sz w:val="40"/>
+          <w:szCs w:val="40"/>
+          <w:lang w:eastAsia="en-IN"/>
+          <w14:ligatures w14:val="none"/>
+        </w:rPr>
+      </w:pPr>
+      <w:r>
+        <w:rPr>
+          <w:rFonts w:ascii="Times New Roman" w:eastAsia="Times New Roman" w:hAnsi="Times New Roman" w:cs="Times New Roman"/>
+          <w:b/>
+          <w:bCs/>
+          <w:kern w:val="0"/>
+          <w:sz w:val="40"/>
+          <w:szCs w:val="40"/>
+          <w:lang w:eastAsia="en-IN"/>
+          <w14:ligatures w14:val="none"/>
+        </w:rPr>
+        <w:lastRenderedPageBreak/>
         <w:t>11. Future Enhancements</w:t>
       </w:r>
     </w:p>
@@ -14206,7 +16075,6 @@
   <w:style w:type="character" w:default="1" w:styleId="DefaultParagraphFont">
     <w:name w:val="Default Paragraph Font"/>
     <w:uiPriority w:val="1"/>
-    <w:semiHidden/>
     <w:unhideWhenUsed/>
   </w:style>
   <w:style w:type="table" w:default="1" w:styleId="TableNormal">

</xml_diff>